<commit_message>
docs(hw01): add student details to report, prompt log and AI-02/AI-03/AI-05 forms
Co-authored-by: Cursor <cursoragent@cursor.com>
</commit_message>
<xml_diff>
--- a/HW01/AI_Forms/[AI-02] - FIT@HCMUS - AI Audit Report_En - HW01.docx
+++ b/HW01/AI_Forms/[AI-02] - FIT@HCMUS - AI Audit Report_En - HW01.docx
@@ -203,6 +203,13 @@
             <w:pPr>
               <w:cnfStyle w:val="000000100000" w:firstRow="0" w:lastRow="0" w:firstColumn="0" w:lastColumn="0" w:oddVBand="0" w:evenVBand="0" w:oddHBand="1" w:evenHBand="0" w:firstRowFirstColumn="0" w:firstRowLastColumn="0" w:lastRowFirstColumn="0" w:lastRowLastColumn="0"/>
             </w:pPr>
+            <w:r>
+              <w:rPr>
+                <w:rFonts w:ascii="Arial" w:hAnsi="Arial"/>
+                <w:sz w:val="21"/>
+              </w:rPr>
+              <w:t>Huỳnh Thái Toàn</w:t>
+            </w:r>
           </w:p>
         </w:tc>
       </w:tr>
@@ -233,6 +240,13 @@
             <w:pPr>
               <w:cnfStyle w:val="000000010000" w:firstRow="0" w:lastRow="0" w:firstColumn="0" w:lastColumn="0" w:oddVBand="0" w:evenVBand="0" w:oddHBand="0" w:evenHBand="1" w:firstRowFirstColumn="0" w:firstRowLastColumn="0" w:lastRowFirstColumn="0" w:lastRowLastColumn="0"/>
             </w:pPr>
+            <w:r>
+              <w:rPr>
+                <w:rFonts w:ascii="Arial" w:hAnsi="Arial"/>
+                <w:sz w:val="21"/>
+              </w:rPr>
+              <w:t>23120175</w:t>
+            </w:r>
           </w:p>
         </w:tc>
       </w:tr>
@@ -263,6 +277,13 @@
             <w:pPr>
               <w:cnfStyle w:val="000000100000" w:firstRow="0" w:lastRow="0" w:firstColumn="0" w:lastColumn="0" w:oddVBand="0" w:evenVBand="0" w:oddHBand="1" w:evenHBand="0" w:firstRowFirstColumn="0" w:firstRowLastColumn="0" w:lastRowFirstColumn="0" w:lastRowLastColumn="0"/>
             </w:pPr>
+            <w:r>
+              <w:rPr>
+                <w:rFonts w:ascii="Arial" w:hAnsi="Arial"/>
+                <w:sz w:val="21"/>
+              </w:rPr>
+              <w:t>CQ2023/31</w:t>
+            </w:r>
           </w:p>
         </w:tc>
       </w:tr>
@@ -331,6 +352,13 @@
             <w:pPr>
               <w:cnfStyle w:val="000000100000" w:firstRow="0" w:lastRow="0" w:firstColumn="0" w:lastColumn="0" w:oddVBand="0" w:evenVBand="0" w:oddHBand="1" w:evenHBand="0" w:firstRowFirstColumn="0" w:firstRowLastColumn="0" w:lastRowFirstColumn="0" w:lastRowLastColumn="0"/>
             </w:pPr>
+            <w:r>
+              <w:rPr>
+                <w:rFonts w:ascii="Arial" w:hAnsi="Arial"/>
+                <w:sz w:val="21"/>
+              </w:rPr>
+              <w:t>26/09/2026</w:t>
+            </w:r>
           </w:p>
         </w:tc>
       </w:tr>
@@ -2470,6 +2498,13 @@
             <w:pPr>
               <w:cnfStyle w:val="100000000000" w:firstRow="1" w:lastRow="0" w:firstColumn="0" w:lastColumn="0" w:oddVBand="0" w:evenVBand="0" w:oddHBand="0" w:evenHBand="0" w:firstRowFirstColumn="0" w:firstRowLastColumn="0" w:lastRowFirstColumn="0" w:lastRowLastColumn="0"/>
             </w:pPr>
+            <w:r>
+              <w:rPr>
+                <w:rFonts w:ascii="Arial" w:hAnsi="Arial"/>
+                <w:sz w:val="21"/>
+              </w:rPr>
+              <w:t>Huỳnh Thái Toàn</w:t>
+            </w:r>
           </w:p>
         </w:tc>
       </w:tr>
@@ -2501,6 +2536,13 @@
             <w:pPr>
               <w:cnfStyle w:val="000000100000" w:firstRow="0" w:lastRow="0" w:firstColumn="0" w:lastColumn="0" w:oddVBand="0" w:evenVBand="0" w:oddHBand="1" w:evenHBand="0" w:firstRowFirstColumn="0" w:firstRowLastColumn="0" w:lastRowFirstColumn="0" w:lastRowLastColumn="0"/>
             </w:pPr>
+            <w:r>
+              <w:rPr>
+                <w:rFonts w:ascii="Arial" w:hAnsi="Arial"/>
+                <w:sz w:val="21"/>
+              </w:rPr>
+              <w:t>23120175</w:t>
+            </w:r>
           </w:p>
         </w:tc>
       </w:tr>
@@ -2532,6 +2574,13 @@
             <w:pPr>
               <w:cnfStyle w:val="000000010000" w:firstRow="0" w:lastRow="0" w:firstColumn="0" w:lastColumn="0" w:oddVBand="0" w:evenVBand="0" w:oddHBand="0" w:evenHBand="1" w:firstRowFirstColumn="0" w:firstRowLastColumn="0" w:lastRowFirstColumn="0" w:lastRowLastColumn="0"/>
             </w:pPr>
+            <w:r>
+              <w:rPr>
+                <w:rFonts w:ascii="Arial" w:hAnsi="Arial"/>
+                <w:sz w:val="21"/>
+              </w:rPr>
+              <w:t>CQ2023/31</w:t>
+            </w:r>
           </w:p>
         </w:tc>
       </w:tr>
@@ -2646,6 +2695,13 @@
             <w:pPr>
               <w:cnfStyle w:val="000000100000" w:firstRow="0" w:lastRow="0" w:firstColumn="0" w:lastColumn="0" w:oddVBand="0" w:evenVBand="0" w:oddHBand="1" w:evenHBand="0" w:firstRowFirstColumn="0" w:firstRowLastColumn="0" w:lastRowFirstColumn="0" w:lastRowLastColumn="0"/>
             </w:pPr>
+            <w:r>
+              <w:rPr>
+                <w:rFonts w:ascii="Arial" w:hAnsi="Arial"/>
+                <w:sz w:val="21"/>
+              </w:rPr>
+              <w:t>26/09/2026</w:t>
+            </w:r>
           </w:p>
         </w:tc>
       </w:tr>

</xml_diff>

<commit_message>
docs(hw01): add R1 mindmap critique with 3 syllabus-verified mistakes and corrected mindmap; update AI audit artifact #1 (R1, G9.1)
Co-authored-by: Cursor <cursoragent@cursor.com>
</commit_message>
<xml_diff>
--- a/HW01/AI_Forms/[AI-02] - FIT@HCMUS - AI Audit Report_En - HW01.docx
+++ b/HW01/AI_Forms/[AI-02] - FIT@HCMUS - AI Audit Report_En - HW01.docx
@@ -719,7 +719,7 @@
                 <w:i w:val="0"/>
                 <w:sz w:val="16"/>
               </w:rPr>
-              <w:t>[pending]</w:t>
+              <w:t>INCOMPLETE</w:t>
             </w:r>
           </w:p>
         </w:tc>
@@ -737,7 +737,7 @@
                 <w:i w:val="0"/>
                 <w:sz w:val="16"/>
               </w:rPr>
-              <w:t>[pending – the 3 mistakes found against ISTQB CTFL v4.0 §1.4 (test activities and work products), §1.4.5 (roles) and §3.1 (static testing)]</w:t>
+              <w:t>The test activities, testware and review process match ISTQB CTFL v4.0.1 §1.4.1, §1.4.3 and §3.2.2, but three mistakes were found (section 1.4): the QA/QC definitions follow the outdated v4.0 wording of §1.2.2; the activities and job titles are not mapped to the two roles of §1.4.5; and test case drafts and report drafts are classified as REPLACE although the R2 and R3 evidence shows they need full human review (§1.4.1, §5.3.2).</w:t>
             </w:r>
           </w:p>
         </w:tc>
@@ -755,7 +755,7 @@
                 <w:i w:val="0"/>
                 <w:sz w:val="16"/>
               </w:rPr>
-              <w:t>[pending – corrected mindmap with the changes highlighted]</w:t>
+              <w:t>Corrected mindmap R1_Mindmap/QAQC_2026_Mindmap_Corrected.png, with the changes labelled FIX 1–3.</w:t>
             </w:r>
           </w:p>
         </w:tc>
@@ -2057,7 +2057,7 @@
                 <w:i w:val="0"/>
                 <w:sz w:val="16"/>
               </w:rPr>
-              <w:t>The drafts need the student's personal details and signatures, and artifacts #1 and #2 are still pending.</w:t>
+              <w:t>The drafts need the student's signatures, and artifact #2 is still pending.</w:t>
             </w:r>
           </w:p>
         </w:tc>
@@ -2205,7 +2205,7 @@
                 <w:i w:val="0"/>
                 <w:sz w:val="21"/>
               </w:rPr>
-              <w:t>11 (artifacts #1, #2 pending)</w:t>
+              <w:t>12 (artifact #2 pending)</w:t>
             </w:r>
           </w:p>
         </w:tc>
@@ -2279,7 +2279,7 @@
                 <w:i w:val="0"/>
                 <w:sz w:val="21"/>
               </w:rPr>
-              <w:t>27.3%</w:t>
+              <w:t>25.0%</w:t>
             </w:r>
           </w:p>
         </w:tc>
@@ -2335,7 +2335,7 @@
                 <w:i w:val="0"/>
                 <w:sz w:val="21"/>
               </w:rPr>
-              <w:t>9.1%</w:t>
+              <w:t>8.3%</w:t>
             </w:r>
           </w:p>
         </w:tc>
@@ -2373,7 +2373,7 @@
                 <w:i w:val="0"/>
                 <w:sz w:val="21"/>
               </w:rPr>
-              <w:t>7 (#3, #5, #6, #7, #10, #11, #13)</w:t>
+              <w:t>8 (#1, #3, #5, #6, #7, #10, #11, #13)</w:t>
             </w:r>
           </w:p>
         </w:tc>
@@ -2391,7 +2391,7 @@
                 <w:i w:val="0"/>
                 <w:sz w:val="21"/>
               </w:rPr>
-              <w:t>63.6%</w:t>
+              <w:t>66.7%</w:t>
             </w:r>
           </w:p>
         </w:tc>
@@ -2445,7 +2445,7 @@
           <w:rFonts w:ascii="Arial" w:hAnsi="Arial"/>
           <w:i w:val="0"/>
         </w:rPr>
-        <w:t>"The QA/QC mindmap, the draft report text for Requirements 1 and 2, the initial and refined test cases for Requirement 3, and the drafts of the AI Audit Report and AI Critique were initially generated by ChatGPT (GPT-5.6 Luna), Cursor Agent (Claude Opus 5.5) and Codex (OpenAI); I reviewed and modified sections 1.3, 2.3–2.4 and 3.3–3.5, added edge cases TC-06, TC-07, TC-10, TC-11 and TC-12 (proposed with Cursor and checked by me against the real Senko B813 fan); the Actual result and Verdict columns of section 3.5 were written entirely by me. The detailed AI Audit Report is attached as Appendix A. I confirm I did not use AI to generate any artifact listed in the prohibited category below."</w:t>
+        <w:t>"The QA/QC mindmap, the draft report text for Requirements 1 and 2, the initial and refined test cases for Requirement 3, and the drafts of the AI Audit Report and AI Critique were initially generated by ChatGPT (GPT-5.6 Luna), Cursor Agent (Claude Opus 5.5) and Codex (OpenAI); I reviewed and modified sections 1.3–1.4 (including the corrected mindmap), 2.3–2.4 and 3.3–3.5, added edge cases TC-06, TC-07, TC-10, TC-11 and TC-12 (proposed with Cursor and checked by me against the real Senko B813 fan); the Actual result and Verdict columns of section 3.5 were written entirely by me. The detailed AI Audit Report is attached as Appendix A. I confirm I did not use AI to generate any artifact listed in the prohibited category below."</w:t>
       </w:r>
     </w:p>
     <w:p>

</xml_diff>

<commit_message>
docs(hw01): disclose Excel workbook as AI artifact #14 in audit, prompt log and AI-02/AI-03 (AI-1, AI-2)
Co-authored-by: Cursor <cursoragent@cursor.com>
</commit_message>
<xml_diff>
--- a/HW01/AI_Forms/[AI-02] - FIT@HCMUS - AI Audit Report_En - HW01.docx
+++ b/HW01/AI_Forms/[AI-02] - FIT@HCMUS - AI Audit Report_En - HW01.docx
@@ -2080,6 +2080,116 @@
           </w:p>
         </w:tc>
       </w:tr>
+      <w:tr>
+        <w:trPr>
+          <w:cnfStyle w:val="000000010000" w:firstRow="0" w:lastRow="0" w:firstColumn="0" w:lastColumn="0" w:oddVBand="0" w:evenVBand="0" w:oddHBand="0" w:evenHBand="1" w:firstRowFirstColumn="0" w:firstRowLastColumn="0" w:lastRowFirstColumn="0" w:lastRowLastColumn="0"/>
+        </w:trPr>
+        <w:tc>
+          <w:tcPr>
+            <w:cnfStyle w:val="001000000000" w:firstRow="0" w:lastRow="0" w:firstColumn="1" w:lastColumn="0" w:oddVBand="0" w:evenVBand="0" w:oddHBand="0" w:evenHBand="0" w:firstRowFirstColumn="0" w:firstRowLastColumn="0" w:lastRowFirstColumn="0" w:lastRowLastColumn="0"/>
+            <w:tcW w:w="2154" w:type="dxa"/>
+          </w:tcPr>
+          <w:p>
+            <w:r>
+              <w:rPr>
+                <w:rFonts w:ascii="Arial" w:hAnsi="Arial"/>
+                <w:i w:val="0"/>
+                <w:sz w:val="16"/>
+              </w:rPr>
+              <w:t>Artifact #14 – Excel test workbook</w:t>
+              <w:br/>
+            </w:r>
+            <w:r>
+              <w:rPr>
+                <w:rFonts w:ascii="Arial" w:hAnsi="Arial"/>
+                <w:i w:val="0"/>
+                <w:sz w:val="16"/>
+              </w:rPr>
+              <w:br/>
+            </w:r>
+            <w:r>
+              <w:rPr>
+                <w:rFonts w:ascii="Arial" w:hAnsi="Arial"/>
+                <w:i w:val="0"/>
+                <w:sz w:val="16"/>
+              </w:rPr>
+              <w:t>Cursor Agent (Claude Opus 5.5), 00:01 27/09/2026, entry CA-51.</w:t>
+            </w:r>
+          </w:p>
+        </w:tc>
+        <w:tc>
+          <w:tcPr>
+            <w:tcW w:w="2041" w:type="dxa"/>
+          </w:tcPr>
+          <w:p>
+            <w:pPr>
+              <w:cnfStyle w:val="000000010000" w:firstRow="0" w:lastRow="0" w:firstColumn="0" w:lastColumn="0" w:oddVBand="0" w:evenVBand="0" w:oddHBand="0" w:evenHBand="1" w:firstRowFirstColumn="0" w:firstRowLastColumn="0" w:lastRowFirstColumn="0" w:lastRowLastColumn="0"/>
+            </w:pPr>
+            <w:r>
+              <w:rPr>
+                <w:rFonts w:ascii="Arial" w:hAnsi="Arial"/>
+                <w:i w:val="0"/>
+                <w:sz w:val="16"/>
+              </w:rPr>
+              <w:t>HW01_Test_Workbook.xlsx (sheets Test Summary, Test Cases, Checklist, Defects) and report section 3.7 (commit e610c41).</w:t>
+            </w:r>
+          </w:p>
+        </w:tc>
+        <w:tc>
+          <w:tcPr>
+            <w:tcW w:w="1020" w:type="dxa"/>
+          </w:tcPr>
+          <w:p>
+            <w:pPr>
+              <w:cnfStyle w:val="000000010000" w:firstRow="0" w:lastRow="0" w:firstColumn="0" w:lastColumn="0" w:oddVBand="0" w:evenVBand="0" w:oddHBand="0" w:evenHBand="1" w:firstRowFirstColumn="0" w:firstRowLastColumn="0" w:lastRowFirstColumn="0" w:lastRowLastColumn="0"/>
+            </w:pPr>
+            <w:r>
+              <w:rPr>
+                <w:rFonts w:ascii="Arial" w:hAnsi="Arial"/>
+                <w:i w:val="0"/>
+                <w:sz w:val="16"/>
+              </w:rPr>
+              <w:t>INCOMPLETE</w:t>
+            </w:r>
+          </w:p>
+        </w:tc>
+        <w:tc>
+          <w:tcPr>
+            <w:tcW w:w="2268" w:type="dxa"/>
+          </w:tcPr>
+          <w:p>
+            <w:pPr>
+              <w:cnfStyle w:val="000000010000" w:firstRow="0" w:lastRow="0" w:firstColumn="0" w:lastColumn="0" w:oddVBand="0" w:evenVBand="0" w:oddHBand="0" w:evenHBand="1" w:firstRowFirstColumn="0" w:firstRowLastColumn="0" w:lastRowFirstColumn="0" w:lastRowLastColumn="0"/>
+            </w:pPr>
+            <w:r>
+              <w:rPr>
+                <w:rFonts w:ascii="Arial" w:hAnsi="Arial"/>
+                <w:i w:val="0"/>
+                <w:sz w:val="16"/>
+              </w:rPr>
+              <w:t>The Test Cases sheet is copied from section 3.5, but the 20 checklist items (checklist-based testing, ISTQB §4.4.3) and the summary formulas are new AI content. The formulas were not recalculated in Excel when generated, and a technique count in the first draft of section 3.7 was wrong (Error guessing 4 instead of 3) until it was checked against the test cases.</w:t>
+            </w:r>
+          </w:p>
+        </w:tc>
+        <w:tc>
+          <w:tcPr>
+            <w:tcW w:w="2154" w:type="dxa"/>
+          </w:tcPr>
+          <w:p>
+            <w:pPr>
+              <w:cnfStyle w:val="000000010000" w:firstRow="0" w:lastRow="0" w:firstColumn="0" w:lastColumn="0" w:oddVBand="0" w:evenVBand="0" w:oddHBand="0" w:evenHBand="1" w:firstRowFirstColumn="0" w:firstRowLastColumn="0" w:lastRowFirstColumn="0" w:lastRowLastColumn="0"/>
+            </w:pPr>
+            <w:r>
+              <w:rPr>
+                <w:rFonts w:ascii="Arial" w:hAnsi="Arial"/>
+                <w:i w:val="0"/>
+                <w:sz w:val="16"/>
+              </w:rPr>
+              <w:t>Count corrected. [Open the workbook in Excel and confirm the formulas and checklist items.]</w:t>
+            </w:r>
+          </w:p>
+        </w:tc>
+      </w:tr>
     </w:tbl>
     <w:p>
       <w:pPr>
@@ -2205,7 +2315,7 @@
                 <w:i w:val="0"/>
                 <w:sz w:val="21"/>
               </w:rPr>
-              <w:t>12 (artifact #2 pending)</w:t>
+              <w:t>13 (artifact #2 pending)</w:t>
             </w:r>
           </w:p>
         </w:tc>
@@ -2279,7 +2389,7 @@
                 <w:i w:val="0"/>
                 <w:sz w:val="21"/>
               </w:rPr>
-              <w:t>25.0%</w:t>
+              <w:t>23.1%</w:t>
             </w:r>
           </w:p>
         </w:tc>
@@ -2335,7 +2445,7 @@
                 <w:i w:val="0"/>
                 <w:sz w:val="21"/>
               </w:rPr>
-              <w:t>8.3%</w:t>
+              <w:t>7.7%</w:t>
             </w:r>
           </w:p>
         </w:tc>
@@ -2373,7 +2483,7 @@
                 <w:i w:val="0"/>
                 <w:sz w:val="21"/>
               </w:rPr>
-              <w:t>8 (#1, #3, #5, #6, #7, #10, #11, #13)</w:t>
+              <w:t>9 (#1, #3, #5, #6, #7, #10, #11, #13, #14)</w:t>
             </w:r>
           </w:p>
         </w:tc>
@@ -2391,7 +2501,7 @@
                 <w:i w:val="0"/>
                 <w:sz w:val="21"/>
               </w:rPr>
-              <w:t>66.7%</w:t>
+              <w:t>69.2%</w:t>
             </w:r>
           </w:p>
         </w:tc>

</xml_diff>

<commit_message>
evidence(hw01): add device photo with student ID card and instructor name in AI-02/AI-03/AI-05 (R3, AI-3)
Co-authored-by: Cursor <cursoragent@cursor.com>
</commit_message>
<xml_diff>
--- a/HW01/AI_Forms/[AI-02] - FIT@HCMUS - AI Audit Report_En - HW01.docx
+++ b/HW01/AI_Forms/[AI-02] - FIT@HCMUS - AI Audit Report_En - HW01.docx
@@ -2774,6 +2774,13 @@
             <w:pPr>
               <w:cnfStyle w:val="000000010000" w:firstRow="0" w:lastRow="0" w:firstColumn="0" w:lastColumn="0" w:oddVBand="0" w:evenVBand="0" w:oddHBand="0" w:evenHBand="1" w:firstRowFirstColumn="0" w:firstRowLastColumn="0" w:lastRowFirstColumn="0" w:lastRowLastColumn="0"/>
             </w:pPr>
+            <w:r>
+              <w:rPr>
+                <w:rFonts w:ascii="Arial" w:hAnsi="Arial"/>
+                <w:sz w:val="21"/>
+              </w:rPr>
+              <w:t>MSc. Trần Thị Bích Hạnh</w:t>
+            </w:r>
           </w:p>
         </w:tc>
       </w:tr>

</xml_diff>

<commit_message>
docs(hw01): update HW01_Report.md and prompt_log.md for clarity and completeness
</commit_message>
<xml_diff>
--- a/HW01/AI_Forms/[AI-02] - FIT@HCMUS - AI Audit Report_En - HW01.docx
+++ b/HW01/AI_Forms/[AI-02] - FIT@HCMUS - AI Audit Report_En - HW01.docx
@@ -793,7 +793,7 @@
                 <w:i w:val="0"/>
                 <w:sz w:val="16"/>
               </w:rPr>
-              <w:t>Codex (OpenAI), 23/09/2026, [prompts to be exported and added to the prompt log].</w:t>
+              <w:t>Codex (OpenAI), 23/09/2026. The prompts are omitted from Appendix A2 by student decision.</w:t>
             </w:r>
           </w:p>
         </w:tc>
@@ -829,7 +829,7 @@
                 <w:i w:val="0"/>
                 <w:sz w:val="16"/>
               </w:rPr>
-              <w:t>[pending]</w:t>
+              <w:t>INCOMPLETE</w:t>
             </w:r>
           </w:p>
         </w:tc>
@@ -847,7 +847,7 @@
                 <w:i w:val="0"/>
                 <w:sz w:val="16"/>
               </w:rPr>
-              <w:t>[pending]</w:t>
+              <w:t>The planning draft exists in Git, but the verbatim prompts are not in the submitted prompt log, so the artifact cannot be audited against ISTQB §3.2 as a complete review item.</w:t>
             </w:r>
           </w:p>
         </w:tc>
@@ -865,7 +865,7 @@
                 <w:i w:val="0"/>
                 <w:sz w:val="16"/>
               </w:rPr>
-              <w:t>[pending]</w:t>
+              <w:t>None. The submitted log keeps only ChatGPT and R1-M01 prompts.</w:t>
             </w:r>
           </w:p>
         </w:tc>
@@ -903,7 +903,7 @@
                 <w:i w:val="0"/>
                 <w:sz w:val="16"/>
               </w:rPr>
-              <w:t>Cursor Agent (Claude Opus 5.5), 16:59–17:59 24/09/2026, entries CA-01 to CA-11.</w:t>
+              <w:t>Cursor Agent (Claude Opus 5.5), 16:59–17:59 24/09/2026. Verbatim prompts omitted from Appendix A2 by student decision.</w:t>
             </w:r>
           </w:p>
         </w:tc>
@@ -1013,7 +1013,7 @@
                 <w:i w:val="0"/>
                 <w:sz w:val="16"/>
               </w:rPr>
-              <w:t>Cursor Agent (Claude Opus 5.5), 18:14 24/09/2026, entry CA-14.</w:t>
+              <w:t>Cursor Agent (Claude Opus 5.5), 18:14 24/09/2026. Verbatim prompt omitted from Appendix A2 by student decision.</w:t>
             </w:r>
           </w:p>
         </w:tc>
@@ -1783,7 +1783,7 @@
                 <w:i w:val="0"/>
                 <w:sz w:val="16"/>
               </w:rPr>
-              <w:t>Cursor Agent (Claude Opus 5.5), 23:24–23:34 26/09/2026, entries CA-37, CA-38 and CA-40.</w:t>
+              <w:t>Cursor Agent (Claude Opus 5.5), 23:24–23:34 26/09/2026. Verbatim prompts omitted from Appendix A2 by student decision.</w:t>
             </w:r>
           </w:p>
         </w:tc>
@@ -1837,7 +1837,7 @@
                 <w:i w:val="0"/>
                 <w:sz w:val="16"/>
               </w:rPr>
-              <w:t>The first draft also assumed piano keys (two keys pressed together, half-pressed key) until the student corrected the control type (CA-38). The pass thresholds (5 s start, 1 cm displacement, ± 1 s sweep period, 60 min endurance) are tester-defined assumptions, and no case has been executed yet.</w:t>
+              <w:t>The first draft also assumed piano keys (two keys pressed together, half-pressed key) until the student corrected the control type. The pass thresholds (5 s start, 1 cm displacement, ± 1 s sweep period, 60 min endurance) are tester-defined assumptions, and no case has been executed yet.</w:t>
             </w:r>
           </w:p>
         </w:tc>
@@ -1893,7 +1893,7 @@
                 <w:i w:val="0"/>
                 <w:sz w:val="16"/>
               </w:rPr>
-              <w:t>Cursor Agent (Claude Opus 5.5), 23:36 26/09/2026, entry CA-41.</w:t>
+              <w:t>Cursor Agent (Claude Opus 5.5), 23:36 26/09/2026. Verbatim prompt omitted from Appendix A2 by student decision.</w:t>
             </w:r>
           </w:p>
         </w:tc>
@@ -2003,7 +2003,7 @@
                 <w:i w:val="0"/>
                 <w:sz w:val="16"/>
               </w:rPr>
-              <w:t>Cursor Agent (Claude Opus 5.5), 23:44 26/09/2026, entry CA-47.</w:t>
+              <w:t>Cursor Agent (Claude Opus 5.5), 23:44 26/09/2026. Verbatim prompt omitted from Appendix A2 by student decision.</w:t>
             </w:r>
           </w:p>
         </w:tc>
@@ -2057,7 +2057,7 @@
                 <w:i w:val="0"/>
                 <w:sz w:val="16"/>
               </w:rPr>
-              <w:t>The drafts need the student's signatures, and artifact #2 is still pending.</w:t>
+              <w:t>The drafts still need the student's signatures.</w:t>
             </w:r>
           </w:p>
         </w:tc>
@@ -2113,7 +2113,7 @@
                 <w:i w:val="0"/>
                 <w:sz w:val="16"/>
               </w:rPr>
-              <w:t>Cursor Agent (Claude Opus 5.5), 00:01 27/09/2026, entry CA-51.</w:t>
+              <w:t>Cursor Agent (Claude Opus 5.5), 00:01 27/09/2026. Verbatim prompt omitted from Appendix A2 by student decision.</w:t>
             </w:r>
           </w:p>
         </w:tc>
@@ -2315,7 +2315,7 @@
                 <w:i w:val="0"/>
                 <w:sz w:val="21"/>
               </w:rPr>
-              <w:t>13 (artifact #2 pending)</w:t>
+              <w:t>14</w:t>
             </w:r>
           </w:p>
         </w:tc>
@@ -2389,7 +2389,7 @@
                 <w:i w:val="0"/>
                 <w:sz w:val="21"/>
               </w:rPr>
-              <w:t>23.1%</w:t>
+              <w:t>21.4%</w:t>
             </w:r>
           </w:p>
         </w:tc>
@@ -2445,7 +2445,7 @@
                 <w:i w:val="0"/>
                 <w:sz w:val="21"/>
               </w:rPr>
-              <w:t>7.7%</w:t>
+              <w:t>7.1%</w:t>
             </w:r>
           </w:p>
         </w:tc>
@@ -2483,7 +2483,7 @@
                 <w:i w:val="0"/>
                 <w:sz w:val="21"/>
               </w:rPr>
-              <w:t>9 (#1, #3, #5, #6, #7, #10, #11, #13, #14)</w:t>
+              <w:t>10 (#1, #2, #3, #5, #6, #7, #10, #11, #13, #14)</w:t>
             </w:r>
           </w:p>
         </w:tc>
@@ -2501,7 +2501,7 @@
                 <w:i w:val="0"/>
                 <w:sz w:val="21"/>
               </w:rPr>
-              <w:t>69.2%</w:t>
+              <w:t>71.4%</w:t>
             </w:r>
           </w:p>
         </w:tc>

</xml_diff>

<commit_message>
docs(hw01): align the AI-02 disclosure with the report
Record the remaining fan defects, verified AI errors, and self-assessment, and state that Cursor formatted the observed results into the report, workbook, and issues.

Co-authored-by: Cursor <cursoragent@cursor.com>
</commit_message>
<xml_diff>
--- a/HW01/AI_Forms/[AI-02] - FIT@HCMUS - AI Audit Report_En - HW01.docx
+++ b/HW01/AI_Forms/[AI-02] - FIT@HCMUS - AI Audit Report_En - HW01.docx
@@ -1,6 +1,6 @@
 
 <file path=word/document.xml><?xml version="1.0" encoding="utf-8"?>
-<w:document xmlns:wpc="http://schemas.microsoft.com/office/word/2010/wordprocessingCanvas" xmlns:cx="http://schemas.microsoft.com/office/drawing/2014/chartex" xmlns:cx1="http://schemas.microsoft.com/office/drawing/2015/9/8/chartex" xmlns:cx2="http://schemas.microsoft.com/office/drawing/2015/10/21/chartex" xmlns:cx3="http://schemas.microsoft.com/office/drawing/2016/5/9/chartex" xmlns:cx4="http://schemas.microsoft.com/office/drawing/2016/5/10/chartex" xmlns:cx5="http://schemas.microsoft.com/office/drawing/2016/5/11/chartex" xmlns:cx6="http://schemas.microsoft.com/office/drawing/2016/5/12/chartex" xmlns:cx7="http://schemas.microsoft.com/office/drawing/2016/5/13/chartex" xmlns:cx8="http://schemas.microsoft.com/office/drawing/2016/5/14/chartex" xmlns:mc="http://schemas.openxmlformats.org/markup-compatibility/2006" xmlns:aink="http://schemas.microsoft.com/office/drawing/2016/ink" xmlns:am3d="http://schemas.microsoft.com/office/drawing/2017/model3d" xmlns:o="urn:schemas-microsoft-com:office:office" xmlns:oel="http://schemas.microsoft.com/office/2019/extlst" xmlns:r="http://schemas.openxmlformats.org/officeDocument/2006/relationships" xmlns:m="http://schemas.openxmlformats.org/officeDocument/2006/math" xmlns:v="urn:schemas-microsoft-com:vml" xmlns:wp14="http://schemas.microsoft.com/office/word/2010/wordprocessingDrawing" xmlns:wp="http://schemas.openxmlformats.org/drawingml/2006/wordprocessingDrawing" xmlns:w10="urn:schemas-microsoft-com:office:word" xmlns:w="http://schemas.openxmlformats.org/wordprocessingml/2006/main" xmlns:w14="http://schemas.microsoft.com/office/word/2010/wordml" xmlns:w15="http://schemas.microsoft.com/office/word/2012/wordml" xmlns:w16cex="http://schemas.microsoft.com/office/word/2018/wordml/cex" xmlns:w16cid="http://schemas.microsoft.com/office/word/2016/wordml/cid" xmlns:w16="http://schemas.microsoft.com/office/word/2018/wordml" xmlns:w16du="http://schemas.microsoft.com/office/word/2023/wordml/word16du" xmlns:w16sdtdh="http://schemas.microsoft.com/office/word/2020/wordml/sdtdatahash" xmlns:w16sdtfl="http://schemas.microsoft.com/office/word/2024/wordml/sdtformatlock" xmlns:w16se="http://schemas.microsoft.com/office/word/2015/wordml/symex" xmlns:wpg="http://schemas.microsoft.com/office/word/2010/wordprocessingGroup" xmlns:wpi="http://schemas.microsoft.com/office/word/2010/wordprocessingInk" xmlns:wne="http://schemas.microsoft.com/office/word/2006/wordml" xmlns:wps="http://schemas.microsoft.com/office/word/2010/wordprocessingShape" mc:Ignorable="w14 w15 w16se w16cid w16 w16cex w16sdtdh w16sdtfl w16du wp14">
+<w:document xmlns:wpc="http://schemas.microsoft.com/office/word/2010/wordprocessingCanvas" xmlns:cx="http://schemas.microsoft.com/office/drawing/2014/chartex" xmlns:cx1="http://schemas.microsoft.com/office/drawing/2015/9/8/chartex" xmlns:cx2="http://schemas.microsoft.com/office/drawing/2015/10/21/chartex" xmlns:cx3="http://schemas.microsoft.com/office/drawing/2016/5/9/chartex" xmlns:cx4="http://schemas.microsoft.com/office/drawing/2016/5/10/chartex" xmlns:cx5="http://schemas.microsoft.com/office/drawing/2016/5/11/chartex" xmlns:cx6="http://schemas.microsoft.com/office/drawing/2016/5/12/chartex" xmlns:cx7="http://schemas.microsoft.com/office/drawing/2016/5/13/chartex" xmlns:cx8="http://schemas.microsoft.com/office/drawing/2016/5/14/chartex" xmlns:mc="http://schemas.openxmlformats.org/markup-compatibility/2006" xmlns:m="http://schemas.openxmlformats.org/officeDocument/2006/math" xmlns:aink="http://schemas.microsoft.com/office/drawing/2016/ink" xmlns:am3d="http://schemas.microsoft.com/office/drawing/2017/model3d" xmlns:oel="http://schemas.microsoft.com/office/2019/extlst" xmlns:r="http://schemas.openxmlformats.org/officeDocument/2006/relationships" xmlns:wp14="http://schemas.microsoft.com/office/word/2010/wordprocessingDrawing" xmlns:wp="http://schemas.openxmlformats.org/drawingml/2006/wordprocessingDrawing" xmlns:wpg="http://schemas.microsoft.com/office/word/2010/wordprocessingGroup" xmlns:wpi="http://schemas.microsoft.com/office/word/2010/wordprocessingInk" xmlns:wps="http://schemas.microsoft.com/office/word/2010/wordprocessingShape" xmlns:o="urn:schemas-microsoft-com:office:office" xmlns:v="urn:schemas-microsoft-com:vml" xmlns:w10="urn:schemas-microsoft-com:office:word" xmlns:w="http://schemas.openxmlformats.org/wordprocessingml/2006/main" xmlns:w14="http://schemas.microsoft.com/office/word/2010/wordml" xmlns:w15="http://schemas.microsoft.com/office/word/2012/wordml" xmlns:w16cex="http://schemas.microsoft.com/office/word/2018/wordml/cex" xmlns:w16cid="http://schemas.microsoft.com/office/word/2016/wordml/cid" xmlns:w16="http://schemas.microsoft.com/office/word/2018/wordml" xmlns:w16sdtdh="http://schemas.microsoft.com/office/word/2020/wordml/sdtdatahash" xmlns:w16sdtfl="http://schemas.microsoft.com/office/word/2024/wordml/sdtformatlock" xmlns:w16se="http://schemas.microsoft.com/office/word/2015/wordml/symex" xmlns:w16du="http://schemas.microsoft.com/office/word/2023/wordml/word16du" xmlns:wne="http://schemas.microsoft.com/office/word/2006/wordml" mc:Ignorable="w14 w15 w16se w16cid w16 w16cex w16sdtdh w16sdtfl w16du wp14">
   <w:body>
     <w:p>
       <w:pPr>
@@ -317,7 +317,6 @@
             <w:r>
               <w:rPr>
                 <w:rFonts w:ascii="Arial" w:hAnsi="Arial"/>
-                <w:i w:val="0"/>
                 <w:sz w:val="21"/>
               </w:rPr>
               <w:t>HW01 (HW01AI)</w:t>
@@ -392,7 +391,6 @@
             <w:r>
               <w:rPr>
                 <w:rFonts w:ascii="Arial" w:hAnsi="Arial"/>
-                <w:i w:val="0"/>
                 <w:sz w:val="21"/>
               </w:rPr>
               <w:t>ChatGPT (GPT-5.6 Luna); Cursor Agent (Claude Opus 5.5); Codex (OpenAI)</w:t>
@@ -430,7 +428,6 @@
             <w:r>
               <w:rPr>
                 <w:rFonts w:ascii="Arial" w:hAnsi="Arial"/>
-                <w:i w:val="0"/>
                 <w:sz w:val="21"/>
               </w:rPr>
               <w:t>[x] Yes  [ ] No</w:t>
@@ -663,26 +660,23 @@
             <w:r>
               <w:rPr>
                 <w:rFonts w:ascii="Arial" w:hAnsi="Arial"/>
-                <w:i w:val="0"/>
                 <w:sz w:val="16"/>
               </w:rPr>
               <w:t>Artifact #1 – R1 QA/QC mindmap</w:t>
+            </w:r>
+            <w:r>
+              <w:rPr>
+                <w:rFonts w:ascii="Arial" w:hAnsi="Arial"/>
+                <w:sz w:val="16"/>
+              </w:rPr>
               <w:br/>
             </w:r>
             <w:r>
               <w:rPr>
                 <w:rFonts w:ascii="Arial" w:hAnsi="Arial"/>
-                <w:i w:val="0"/>
                 <w:sz w:val="16"/>
               </w:rPr>
               <w:br/>
-            </w:r>
-            <w:r>
-              <w:rPr>
-                <w:rFonts w:ascii="Arial" w:hAnsi="Arial"/>
-                <w:i w:val="0"/>
-                <w:sz w:val="16"/>
-              </w:rPr>
               <w:t>Cursor Agent (Claude Opus 5.5), 18:08 24/09/2026, entry R1-M01.</w:t>
             </w:r>
           </w:p>
@@ -698,7 +692,6 @@
             <w:r>
               <w:rPr>
                 <w:rFonts w:ascii="Arial" w:hAnsi="Arial"/>
-                <w:i w:val="0"/>
                 <w:sz w:val="16"/>
               </w:rPr>
               <w:t>R1_Mindmap/QAQC_2026_Mindmap.png and .mmd.</w:t>
@@ -716,7 +709,6 @@
             <w:r>
               <w:rPr>
                 <w:rFonts w:ascii="Arial" w:hAnsi="Arial"/>
-                <w:i w:val="0"/>
                 <w:sz w:val="16"/>
               </w:rPr>
               <w:t>INCOMPLETE</w:t>
@@ -734,10 +726,17 @@
             <w:r>
               <w:rPr>
                 <w:rFonts w:ascii="Arial" w:hAnsi="Arial"/>
-                <w:i w:val="0"/>
                 <w:sz w:val="16"/>
               </w:rPr>
-              <w:t>The test activities, testware and review process match ISTQB CTFL v4.0.1 §1.4.1, §1.4.3 and §3.2.2, but three mistakes were found (section 1.4): the QA/QC definitions follow the outdated v4.0 wording of §1.2.2; the activities and job titles are not mapped to the two roles of §1.4.5; and test case drafts and report drafts are classified as REPLACE although the R2 and R3 evidence shows they need full human review (§1.4.1, §5.3.2).</w:t>
+              <w:t xml:space="preserve">The test activities, testware and review process match ISTQB CTFL v4.0.1 §1.4.1, §1.4.3 and §3.2.2, but three mistakes were found (section 1.4): the QA/QC definitions follow the outdated v4.0 wording of §1.2.2; the activities and job titles are not mapped to the two roles of §1.4.5; and test case drafts and report drafts </w:t>
+            </w:r>
+            <w:r>
+              <w:rPr>
+                <w:rFonts w:ascii="Arial" w:hAnsi="Arial"/>
+                <w:sz w:val="16"/>
+              </w:rPr>
+              <w:lastRenderedPageBreak/>
+              <w:t>are classified as REPLACE although the R2 and R3 evidence shows they need full human review (§1.4.1, §5.3.2).</w:t>
             </w:r>
           </w:p>
         </w:tc>
@@ -752,9 +751,9 @@
             <w:r>
               <w:rPr>
                 <w:rFonts w:ascii="Arial" w:hAnsi="Arial"/>
-                <w:i w:val="0"/>
                 <w:sz w:val="16"/>
               </w:rPr>
+              <w:lastRenderedPageBreak/>
               <w:t>Corrected mindmap R1_Mindmap/QAQC_2026_Mindmap_Corrected.png, with the changes labelled FIX 1–3.</w:t>
             </w:r>
           </w:p>
@@ -773,27 +772,24 @@
             <w:r>
               <w:rPr>
                 <w:rFonts w:ascii="Arial" w:hAnsi="Arial"/>
-                <w:i w:val="0"/>
                 <w:sz w:val="16"/>
               </w:rPr>
               <w:t>Artifact #2 – R1 first report draft (planning session)</w:t>
+            </w:r>
+            <w:r>
+              <w:rPr>
+                <w:rFonts w:ascii="Arial" w:hAnsi="Arial"/>
+                <w:sz w:val="16"/>
+              </w:rPr>
               <w:br/>
             </w:r>
             <w:r>
               <w:rPr>
                 <w:rFonts w:ascii="Arial" w:hAnsi="Arial"/>
-                <w:i w:val="0"/>
                 <w:sz w:val="16"/>
               </w:rPr>
               <w:br/>
-            </w:r>
-            <w:r>
-              <w:rPr>
-                <w:rFonts w:ascii="Arial" w:hAnsi="Arial"/>
-                <w:i w:val="0"/>
-                <w:sz w:val="16"/>
-              </w:rPr>
-              <w:t>Codex (OpenAI), 23/09/2026. The prompts are omitted from Appendix A2 by student decision.</w:t>
+              <w:t>Codex (OpenAI), 23/09/2026. The prompt is recorded in Appendix A2 (prompt_log.md).</w:t>
             </w:r>
           </w:p>
         </w:tc>
@@ -808,7 +804,6 @@
             <w:r>
               <w:rPr>
                 <w:rFonts w:ascii="Arial" w:hAnsi="Arial"/>
-                <w:i w:val="0"/>
                 <w:sz w:val="16"/>
               </w:rPr>
               <w:t>PLAN.md and the first R1 draft (commits e7e4d1d–bbbbb2a).</w:t>
@@ -826,7 +821,6 @@
             <w:r>
               <w:rPr>
                 <w:rFonts w:ascii="Arial" w:hAnsi="Arial"/>
-                <w:i w:val="0"/>
                 <w:sz w:val="16"/>
               </w:rPr>
               <w:t>INCOMPLETE</w:t>
@@ -844,10 +838,9 @@
             <w:r>
               <w:rPr>
                 <w:rFonts w:ascii="Arial" w:hAnsi="Arial"/>
-                <w:i w:val="0"/>
                 <w:sz w:val="16"/>
               </w:rPr>
-              <w:t>The planning draft exists in Git, but the verbatim prompts are not in the submitted prompt log, so the artifact cannot be audited against ISTQB §3.2 as a complete review item.</w:t>
+              <w:t>The prompt and output are recorded in Appendix A2 (prompt_log.md). The draft was reviewed against the assignment specification (ISTQB §3.2).</w:t>
             </w:r>
           </w:p>
         </w:tc>
@@ -862,10 +855,9 @@
             <w:r>
               <w:rPr>
                 <w:rFonts w:ascii="Arial" w:hAnsi="Arial"/>
-                <w:i w:val="0"/>
                 <w:sz w:val="16"/>
               </w:rPr>
-              <w:t>None. The submitted log keeps only ChatGPT and R1-M01 prompts.</w:t>
+              <w:t>The prompt is recorded in Appendix A2 (prompt_log.md).</w:t>
             </w:r>
           </w:p>
         </w:tc>
@@ -883,27 +875,24 @@
             <w:r>
               <w:rPr>
                 <w:rFonts w:ascii="Arial" w:hAnsi="Arial"/>
-                <w:i w:val="0"/>
                 <w:sz w:val="16"/>
               </w:rPr>
               <w:t>Artifact #3 – R1 job-posting records (revisions)</w:t>
+            </w:r>
+            <w:r>
+              <w:rPr>
+                <w:rFonts w:ascii="Arial" w:hAnsi="Arial"/>
+                <w:sz w:val="16"/>
+              </w:rPr>
               <w:br/>
             </w:r>
             <w:r>
               <w:rPr>
                 <w:rFonts w:ascii="Arial" w:hAnsi="Arial"/>
-                <w:i w:val="0"/>
                 <w:sz w:val="16"/>
               </w:rPr>
               <w:br/>
-            </w:r>
-            <w:r>
-              <w:rPr>
-                <w:rFonts w:ascii="Arial" w:hAnsi="Arial"/>
-                <w:i w:val="0"/>
-                <w:sz w:val="16"/>
-              </w:rPr>
-              <w:t>Cursor Agent (Claude Opus 5.5), 16:59–17:59 24/09/2026. Verbatim prompts omitted from Appendix A2 by student decision.</w:t>
+              <w:t>Cursor Agent (Claude Opus 5.5), 16:59–17:59 24/09/2026. The prompts are recorded in Appendix A2 (prompt_log.md).</w:t>
             </w:r>
           </w:p>
         </w:tc>
@@ -918,7 +907,6 @@
             <w:r>
               <w:rPr>
                 <w:rFonts w:ascii="Arial" w:hAnsi="Arial"/>
-                <w:i w:val="0"/>
                 <w:sz w:val="16"/>
               </w:rPr>
               <w:t>report sections 1.2–1.3 (commits 7356154–b113c6e).</w:t>
@@ -936,7 +924,6 @@
             <w:r>
               <w:rPr>
                 <w:rFonts w:ascii="Arial" w:hAnsi="Arial"/>
-                <w:i w:val="0"/>
                 <w:sz w:val="16"/>
               </w:rPr>
               <w:t>INCOMPLETE</w:t>
@@ -954,7 +941,6 @@
             <w:r>
               <w:rPr>
                 <w:rFonts w:ascii="Arial" w:hAnsi="Arial"/>
-                <w:i w:val="0"/>
                 <w:sz w:val="16"/>
               </w:rPr>
               <w:t>The draft contained fields the specification does not ask for, placeholder descriptions, postings without valid posting-date evidence, and two expired postings (JP08, JP09). These were found by reviewing the work product against the assignment specification, as in the review process of ISTQB §3.2.</w:t>
@@ -972,7 +958,6 @@
             <w:r>
               <w:rPr>
                 <w:rFonts w:ascii="Arial" w:hAnsi="Arial"/>
-                <w:i w:val="0"/>
                 <w:sz w:val="16"/>
               </w:rPr>
               <w:t>Removed the extra fields; replaced JP01 and JP05–JP09 with postings inside the 60-day window; recaptured dated screenshots showing the login name.</w:t>
@@ -993,27 +978,24 @@
             <w:r>
               <w:rPr>
                 <w:rFonts w:ascii="Arial" w:hAnsi="Arial"/>
-                <w:i w:val="0"/>
                 <w:sz w:val="16"/>
               </w:rPr>
               <w:t>Artifact #4 – R2 defect records D01–D20</w:t>
+            </w:r>
+            <w:r>
+              <w:rPr>
+                <w:rFonts w:ascii="Arial" w:hAnsi="Arial"/>
+                <w:sz w:val="16"/>
+              </w:rPr>
               <w:br/>
             </w:r>
             <w:r>
               <w:rPr>
                 <w:rFonts w:ascii="Arial" w:hAnsi="Arial"/>
-                <w:i w:val="0"/>
                 <w:sz w:val="16"/>
               </w:rPr>
               <w:br/>
-            </w:r>
-            <w:r>
-              <w:rPr>
-                <w:rFonts w:ascii="Arial" w:hAnsi="Arial"/>
-                <w:i w:val="0"/>
-                <w:sz w:val="16"/>
-              </w:rPr>
-              <w:t>Cursor Agent (Claude Opus 5.5), 18:14 24/09/2026. Verbatim prompt omitted from Appendix A2 by student decision.</w:t>
+              <w:t>Cursor Agent (Claude Opus 5.5), 18:14 24/09/2026. The prompt is recorded in Appendix A2 (prompt_log.md).</w:t>
             </w:r>
           </w:p>
         </w:tc>
@@ -1028,7 +1010,6 @@
             <w:r>
               <w:rPr>
                 <w:rFonts w:ascii="Arial" w:hAnsi="Arial"/>
-                <w:i w:val="0"/>
                 <w:sz w:val="16"/>
               </w:rPr>
               <w:t>report sections 2.1–2.3 (commit a3bb017).</w:t>
@@ -1046,7 +1027,6 @@
             <w:r>
               <w:rPr>
                 <w:rFonts w:ascii="Arial" w:hAnsi="Arial"/>
-                <w:i w:val="0"/>
                 <w:sz w:val="16"/>
               </w:rPr>
               <w:t>VALID</w:t>
@@ -1064,10 +1044,9 @@
             <w:r>
               <w:rPr>
                 <w:rFonts w:ascii="Arial" w:hAnsi="Arial"/>
-                <w:i w:val="0"/>
                 <w:sz w:val="16"/>
               </w:rPr>
-              <w:t>Each record links to a primary source (vendor report, NVD, regulator or court decision). All 20 defects fall in 2022–2025, 7 are AI/LLM-related (≥ 5 required), and each has the description, severity and impact attributes of a defect report (ISTQB §5.5). [Student: confirm after spot-checking the sources.]</w:t>
+              <w:t>Each record links to a primary source (vendor report, NVD, regulator or court decision). All 20 defects fall in 2022–2025, 7 are AI/LLM-related (≥ 5 required), and each has the description, severity and impact attributes of a defect report (ISTQB §5.5). On 27/09/2026 the sources in section 2.3 were spot-checked against the primary pages used in section 2.4. The records were kept.</w:t>
             </w:r>
           </w:p>
         </w:tc>
@@ -1082,7 +1061,6 @@
             <w:r>
               <w:rPr>
                 <w:rFonts w:ascii="Arial" w:hAnsi="Arial"/>
-                <w:i w:val="0"/>
                 <w:sz w:val="16"/>
               </w:rPr>
               <w:t>None.</w:t>
@@ -1103,26 +1081,23 @@
             <w:r>
               <w:rPr>
                 <w:rFonts w:ascii="Arial" w:hAnsi="Arial"/>
-                <w:i w:val="0"/>
                 <w:sz w:val="16"/>
               </w:rPr>
               <w:t>Artifact #5 – R2-B01, AI explanations of D01–D10</w:t>
+            </w:r>
+            <w:r>
+              <w:rPr>
+                <w:rFonts w:ascii="Arial" w:hAnsi="Arial"/>
+                <w:sz w:val="16"/>
+              </w:rPr>
               <w:br/>
             </w:r>
             <w:r>
               <w:rPr>
                 <w:rFonts w:ascii="Arial" w:hAnsi="Arial"/>
-                <w:i w:val="0"/>
                 <w:sz w:val="16"/>
               </w:rPr>
               <w:br/>
-            </w:r>
-            <w:r>
-              <w:rPr>
-                <w:rFonts w:ascii="Arial" w:hAnsi="Arial"/>
-                <w:i w:val="0"/>
-                <w:sz w:val="16"/>
-              </w:rPr>
               <w:t>ChatGPT (GPT-5.6 Luna), 23:19 24/09/2026, entry R2-B01.</w:t>
             </w:r>
           </w:p>
@@ -1138,7 +1113,6 @@
             <w:r>
               <w:rPr>
                 <w:rFonts w:ascii="Arial" w:hAnsi="Arial"/>
-                <w:i w:val="0"/>
                 <w:sz w:val="16"/>
               </w:rPr>
               <w:t>verbatim in entry R2-B01.</w:t>
@@ -1156,7 +1130,6 @@
             <w:r>
               <w:rPr>
                 <w:rFonts w:ascii="Arial" w:hAnsi="Arial"/>
-                <w:i w:val="0"/>
                 <w:sz w:val="16"/>
               </w:rPr>
               <w:t>INCOMPLETE</w:t>
@@ -1174,7 +1147,6 @@
             <w:r>
               <w:rPr>
                 <w:rFonts w:ascii="Arial" w:hAnsi="Arial"/>
-                <w:i w:val="0"/>
                 <w:sz w:val="16"/>
               </w:rPr>
               <w:t>4 of 10 explanations contain verified errors: the FAA ground-stop timeline (D04), an invented expansion of FPRSA-R (D05), the AT&amp;T restoration time (D06), and a one-sided CVSS score with an incomplete fix (D09). A defect report must be correct and traceable to its source (ISTQB §5.5), so every claim was checked against the primary source.</w:t>
@@ -1192,7 +1164,6 @@
             <w:r>
               <w:rPr>
                 <w:rFonts w:ascii="Arial" w:hAnsi="Arial"/>
-                <w:i w:val="0"/>
                 <w:sz w:val="16"/>
               </w:rPr>
               <w:t>Corrected facts in section 2.3; errors recorded in section 2.4.</w:t>
@@ -1213,26 +1184,23 @@
             <w:r>
               <w:rPr>
                 <w:rFonts w:ascii="Arial" w:hAnsi="Arial"/>
-                <w:i w:val="0"/>
                 <w:sz w:val="16"/>
               </w:rPr>
               <w:t>Artifact #6 – R2-B02, AI explanations of D11–D20</w:t>
+            </w:r>
+            <w:r>
+              <w:rPr>
+                <w:rFonts w:ascii="Arial" w:hAnsi="Arial"/>
+                <w:sz w:val="16"/>
+              </w:rPr>
               <w:br/>
             </w:r>
             <w:r>
               <w:rPr>
                 <w:rFonts w:ascii="Arial" w:hAnsi="Arial"/>
-                <w:i w:val="0"/>
                 <w:sz w:val="16"/>
               </w:rPr>
               <w:br/>
-            </w:r>
-            <w:r>
-              <w:rPr>
-                <w:rFonts w:ascii="Arial" w:hAnsi="Arial"/>
-                <w:i w:val="0"/>
-                <w:sz w:val="16"/>
-              </w:rPr>
               <w:t>ChatGPT (GPT-5.6 Luna), 23:19 24/09/2026, entry R2-B02.</w:t>
             </w:r>
           </w:p>
@@ -1248,7 +1216,6 @@
             <w:r>
               <w:rPr>
                 <w:rFonts w:ascii="Arial" w:hAnsi="Arial"/>
-                <w:i w:val="0"/>
                 <w:sz w:val="16"/>
               </w:rPr>
               <w:t>verbatim in entry R2-B02.</w:t>
@@ -1266,7 +1233,6 @@
             <w:r>
               <w:rPr>
                 <w:rFonts w:ascii="Arial" w:hAnsi="Arial"/>
-                <w:i w:val="0"/>
                 <w:sz w:val="16"/>
               </w:rPr>
               <w:t>INCOMPLETE</w:t>
@@ -1284,7 +1250,6 @@
             <w:r>
               <w:rPr>
                 <w:rFonts w:ascii="Arial" w:hAnsi="Arial"/>
-                <w:i w:val="0"/>
                 <w:sz w:val="16"/>
               </w:rPr>
               <w:t>3 of 10 explanations contain verified errors: a gender assumption and an amount given without its breakdown (D15), and fabricated or mismatched source URLs and dates (D16, D17). Same basis as artifact #5 (ISTQB §5.5).</w:t>
@@ -1302,7 +1267,6 @@
             <w:r>
               <w:rPr>
                 <w:rFonts w:ascii="Arial" w:hAnsi="Arial"/>
-                <w:i w:val="0"/>
                 <w:sz w:val="16"/>
               </w:rPr>
               <w:t>Corrected facts and sources in section 2.3; errors recorded in section 2.4.</w:t>
@@ -1323,26 +1287,23 @@
             <w:r>
               <w:rPr>
                 <w:rFonts w:ascii="Arial" w:hAnsi="Arial"/>
-                <w:i w:val="0"/>
                 <w:sz w:val="16"/>
               </w:rPr>
               <w:t>Artifact #7 – R2-B03, follow-up questions</w:t>
+            </w:r>
+            <w:r>
+              <w:rPr>
+                <w:rFonts w:ascii="Arial" w:hAnsi="Arial"/>
+                <w:sz w:val="16"/>
+              </w:rPr>
               <w:br/>
             </w:r>
             <w:r>
               <w:rPr>
                 <w:rFonts w:ascii="Arial" w:hAnsi="Arial"/>
-                <w:i w:val="0"/>
                 <w:sz w:val="16"/>
               </w:rPr>
               <w:br/>
-            </w:r>
-            <w:r>
-              <w:rPr>
-                <w:rFonts w:ascii="Arial" w:hAnsi="Arial"/>
-                <w:i w:val="0"/>
-                <w:sz w:val="16"/>
-              </w:rPr>
               <w:t>ChatGPT (GPT-5.6 Luna), 23:29 24/09/2026, entry R2-B03.</w:t>
             </w:r>
           </w:p>
@@ -1358,7 +1319,6 @@
             <w:r>
               <w:rPr>
                 <w:rFonts w:ascii="Arial" w:hAnsi="Arial"/>
-                <w:i w:val="0"/>
                 <w:sz w:val="16"/>
               </w:rPr>
               <w:t>verbatim in entry R2-B03.</w:t>
@@ -1376,7 +1336,6 @@
             <w:r>
               <w:rPr>
                 <w:rFonts w:ascii="Arial" w:hAnsi="Arial"/>
-                <w:i w:val="0"/>
                 <w:sz w:val="16"/>
               </w:rPr>
               <w:t>INCOMPLETE</w:t>
@@ -1394,7 +1353,6 @@
             <w:r>
               <w:rPr>
                 <w:rFonts w:ascii="Arial" w:hAnsi="Arial"/>
-                <w:i w:val="0"/>
                 <w:sz w:val="16"/>
               </w:rPr>
               <w:t>3 of 13 answers contain verified errors: a misattributed CrowdStrike source (D01), a non-resolving www-dev.volexity.com host (D12), and a wrong LangChain fix version, 0.0.132 instead of 0.0.142 (D18).</w:t>
@@ -1412,7 +1370,6 @@
             <w:r>
               <w:rPr>
                 <w:rFonts w:ascii="Arial" w:hAnsi="Arial"/>
-                <w:i w:val="0"/>
                 <w:sz w:val="16"/>
               </w:rPr>
               <w:t>Correct sources and version recorded in section 2.4.</w:t>
@@ -1433,26 +1390,24 @@
             <w:r>
               <w:rPr>
                 <w:rFonts w:ascii="Arial" w:hAnsi="Arial"/>
-                <w:i w:val="0"/>
                 <w:sz w:val="16"/>
               </w:rPr>
+              <w:lastRenderedPageBreak/>
               <w:t>Artifact #8 – R2-B04, second follow-up</w:t>
+            </w:r>
+            <w:r>
+              <w:rPr>
+                <w:rFonts w:ascii="Arial" w:hAnsi="Arial"/>
+                <w:sz w:val="16"/>
+              </w:rPr>
               <w:br/>
             </w:r>
             <w:r>
               <w:rPr>
                 <w:rFonts w:ascii="Arial" w:hAnsi="Arial"/>
-                <w:i w:val="0"/>
                 <w:sz w:val="16"/>
               </w:rPr>
               <w:br/>
-            </w:r>
-            <w:r>
-              <w:rPr>
-                <w:rFonts w:ascii="Arial" w:hAnsi="Arial"/>
-                <w:i w:val="0"/>
-                <w:sz w:val="16"/>
-              </w:rPr>
               <w:t>ChatGPT (GPT-5.6 Luna), 23:43 24/09/2026, entry R2-B04.</w:t>
             </w:r>
           </w:p>
@@ -1468,7 +1423,6 @@
             <w:r>
               <w:rPr>
                 <w:rFonts w:ascii="Arial" w:hAnsi="Arial"/>
-                <w:i w:val="0"/>
                 <w:sz w:val="16"/>
               </w:rPr>
               <w:t>verbatim in entry R2-B04.</w:t>
@@ -1486,7 +1440,6 @@
             <w:r>
               <w:rPr>
                 <w:rFonts w:ascii="Arial" w:hAnsi="Arial"/>
-                <w:i w:val="0"/>
                 <w:sz w:val="16"/>
               </w:rPr>
               <w:t>VALID</w:t>
@@ -1504,7 +1457,6 @@
             <w:r>
               <w:rPr>
                 <w:rFonts w:ascii="Arial" w:hAnsi="Arial"/>
-                <w:i w:val="0"/>
                 <w:sz w:val="16"/>
               </w:rPr>
               <w:t>Every checked claim matched the primary sources. The Scribd source cited for D14 could not be checked, so it is not counted as an error.</w:t>
@@ -1522,7 +1474,6 @@
             <w:r>
               <w:rPr>
                 <w:rFonts w:ascii="Arial" w:hAnsi="Arial"/>
-                <w:i w:val="0"/>
                 <w:sz w:val="16"/>
               </w:rPr>
               <w:t>None.</w:t>
@@ -1543,26 +1494,23 @@
             <w:r>
               <w:rPr>
                 <w:rFonts w:ascii="Arial" w:hAnsi="Arial"/>
-                <w:i w:val="0"/>
                 <w:sz w:val="16"/>
               </w:rPr>
               <w:t>Artifact #9 – R3-T01, first 15 test cases</w:t>
+            </w:r>
+            <w:r>
+              <w:rPr>
+                <w:rFonts w:ascii="Arial" w:hAnsi="Arial"/>
+                <w:sz w:val="16"/>
+              </w:rPr>
               <w:br/>
             </w:r>
             <w:r>
               <w:rPr>
                 <w:rFonts w:ascii="Arial" w:hAnsi="Arial"/>
-                <w:i w:val="0"/>
                 <w:sz w:val="16"/>
               </w:rPr>
               <w:br/>
-            </w:r>
-            <w:r>
-              <w:rPr>
-                <w:rFonts w:ascii="Arial" w:hAnsi="Arial"/>
-                <w:i w:val="0"/>
-                <w:sz w:val="16"/>
-              </w:rPr>
               <w:t>ChatGPT (GPT-5.6 Luna), 23:24 26/09/2026, entry R3-T01.</w:t>
             </w:r>
           </w:p>
@@ -1578,7 +1526,6 @@
             <w:r>
               <w:rPr>
                 <w:rFonts w:ascii="Arial" w:hAnsi="Arial"/>
-                <w:i w:val="0"/>
                 <w:sz w:val="16"/>
               </w:rPr>
               <w:t>verbatim in entry R3-T01.</w:t>
@@ -1596,7 +1543,6 @@
             <w:r>
               <w:rPr>
                 <w:rFonts w:ascii="Arial" w:hAnsi="Arial"/>
-                <w:i w:val="0"/>
                 <w:sz w:val="16"/>
               </w:rPr>
               <w:t>INVALID</w:t>
@@ -1614,7 +1560,6 @@
             <w:r>
               <w:rPr>
                 <w:rFonts w:ascii="Arial" w:hAnsi="Arial"/>
-                <w:i w:val="0"/>
                 <w:sz w:val="16"/>
               </w:rPr>
               <w:t>The prompt described the speed control ambiguously; ChatGPT assumed piano keys, while the fan has a rotary knob, so the state model behind the test cases does not match the device (ISTQB §4.2.4). TC-14 is also internally inconsistent: its steps leave Speed 2 selected, but its expected result assumes Off.</w:t>
@@ -1632,7 +1577,6 @@
             <w:r>
               <w:rPr>
                 <w:rFonts w:ascii="Arial" w:hAnsi="Arial"/>
-                <w:i w:val="0"/>
                 <w:sz w:val="16"/>
               </w:rPr>
               <w:t>Rejected. The prompt was corrected and re-sent as R3-T02.</w:t>
@@ -1653,26 +1597,23 @@
             <w:r>
               <w:rPr>
                 <w:rFonts w:ascii="Arial" w:hAnsi="Arial"/>
-                <w:i w:val="0"/>
                 <w:sz w:val="16"/>
               </w:rPr>
               <w:t>Artifact #10 – R3-T02, 15 test cases (corrected prompt)</w:t>
+            </w:r>
+            <w:r>
+              <w:rPr>
+                <w:rFonts w:ascii="Arial" w:hAnsi="Arial"/>
+                <w:sz w:val="16"/>
+              </w:rPr>
               <w:br/>
             </w:r>
             <w:r>
               <w:rPr>
                 <w:rFonts w:ascii="Arial" w:hAnsi="Arial"/>
-                <w:i w:val="0"/>
                 <w:sz w:val="16"/>
               </w:rPr>
               <w:br/>
-            </w:r>
-            <w:r>
-              <w:rPr>
-                <w:rFonts w:ascii="Arial" w:hAnsi="Arial"/>
-                <w:i w:val="0"/>
-                <w:sz w:val="16"/>
-              </w:rPr>
               <w:t>ChatGPT (GPT-5.6 Luna), 23:33 26/09/2026, entry R3-T02.</w:t>
             </w:r>
           </w:p>
@@ -1688,7 +1629,6 @@
             <w:r>
               <w:rPr>
                 <w:rFonts w:ascii="Arial" w:hAnsi="Arial"/>
-                <w:i w:val="0"/>
                 <w:sz w:val="16"/>
               </w:rPr>
               <w:t>verbatim in entry R3-T02; screenshot R3_Device/ai_output_R3-T02.png.</w:t>
@@ -1706,7 +1646,6 @@
             <w:r>
               <w:rPr>
                 <w:rFonts w:ascii="Arial" w:hAnsi="Arial"/>
-                <w:i w:val="0"/>
                 <w:sz w:val="16"/>
               </w:rPr>
               <w:t>INCOMPLETE</w:t>
@@ -1724,7 +1663,6 @@
             <w:r>
               <w:rPr>
                 <w:rFonts w:ascii="Arial" w:hAnsi="Arial"/>
-                <w:i w:val="0"/>
                 <w:sz w:val="16"/>
               </w:rPr>
               <w:t>Of the 15 cases, 4 are valid, 1 is invalid (TC06: a direct 0 → 3 transition is impossible on a sequential knob, ISTQB §4.2.4), and 10 have unmeasurable expected results. The suite misses the knob's end positions (§4.2.2 boundary value analysis), speed × oscillation and power × knob combinations (§4.2.3 decision tables), and error-guessing cases (§4.4.1). Details in section 3.3.</w:t>
@@ -1742,10 +1680,112 @@
             <w:r>
               <w:rPr>
                 <w:rFonts w:ascii="Arial" w:hAnsi="Arial"/>
-                <w:i w:val="0"/>
                 <w:sz w:val="16"/>
               </w:rPr>
               <w:t>Final suite in section 3.5. Changes: measurable thresholds, AI TC06 removed, TC-06, TC-07, TC-10, TC-11 and TC-12 added.</w:t>
+            </w:r>
+          </w:p>
+        </w:tc>
+      </w:tr>
+      <w:tr>
+        <w:trPr>
+          <w:cnfStyle w:val="000000100000" w:firstRow="0" w:lastRow="0" w:firstColumn="0" w:lastColumn="0" w:oddVBand="0" w:evenVBand="0" w:oddHBand="1" w:evenHBand="0" w:firstRowFirstColumn="0" w:firstRowLastColumn="0" w:lastRowFirstColumn="0" w:lastRowLastColumn="0"/>
+        </w:trPr>
+        <w:tc>
+          <w:tcPr>
+            <w:cnfStyle w:val="001000000000" w:firstRow="0" w:lastRow="0" w:firstColumn="1" w:lastColumn="0" w:oddVBand="0" w:evenVBand="0" w:oddHBand="0" w:evenHBand="0" w:firstRowFirstColumn="0" w:firstRowLastColumn="0" w:lastRowFirstColumn="0" w:lastRowLastColumn="0"/>
+            <w:tcW w:w="2154" w:type="dxa"/>
+          </w:tcPr>
+          <w:p>
+            <w:r>
+              <w:rPr>
+                <w:rFonts w:ascii="Arial" w:hAnsi="Arial"/>
+                <w:sz w:val="16"/>
+              </w:rPr>
+              <w:t>Artifact #11 – R3 refined test suite draft</w:t>
+            </w:r>
+            <w:r>
+              <w:rPr>
+                <w:rFonts w:ascii="Arial" w:hAnsi="Arial"/>
+                <w:sz w:val="16"/>
+              </w:rPr>
+              <w:br/>
+            </w:r>
+            <w:r>
+              <w:rPr>
+                <w:rFonts w:ascii="Arial" w:hAnsi="Arial"/>
+                <w:sz w:val="16"/>
+              </w:rPr>
+              <w:br/>
+              <w:t>Cursor Agent (Claude Opus 5.5), 23:24–23:34 26/09/2026. The prompts are recorded in Appendix A2 (prompt_log.md).</w:t>
+            </w:r>
+          </w:p>
+        </w:tc>
+        <w:tc>
+          <w:tcPr>
+            <w:tcW w:w="2041" w:type="dxa"/>
+          </w:tcPr>
+          <w:p>
+            <w:pPr>
+              <w:cnfStyle w:val="000000100000" w:firstRow="0" w:lastRow="0" w:firstColumn="0" w:lastColumn="0" w:oddVBand="0" w:evenVBand="0" w:oddHBand="1" w:evenHBand="0" w:firstRowFirstColumn="0" w:firstRowLastColumn="0" w:lastRowFirstColumn="0" w:lastRowLastColumn="0"/>
+            </w:pPr>
+            <w:r>
+              <w:rPr>
+                <w:rFonts w:ascii="Arial" w:hAnsi="Arial"/>
+                <w:sz w:val="16"/>
+              </w:rPr>
+              <w:t>report sections 3.1–3.5 (commits 3414a2d, b36f3f4, f2a856f).</w:t>
+            </w:r>
+          </w:p>
+        </w:tc>
+        <w:tc>
+          <w:tcPr>
+            <w:tcW w:w="1020" w:type="dxa"/>
+          </w:tcPr>
+          <w:p>
+            <w:pPr>
+              <w:cnfStyle w:val="000000100000" w:firstRow="0" w:lastRow="0" w:firstColumn="0" w:lastColumn="0" w:oddVBand="0" w:evenVBand="0" w:oddHBand="1" w:evenHBand="0" w:firstRowFirstColumn="0" w:firstRowLastColumn="0" w:lastRowFirstColumn="0" w:lastRowLastColumn="0"/>
+            </w:pPr>
+            <w:r>
+              <w:rPr>
+                <w:rFonts w:ascii="Arial" w:hAnsi="Arial"/>
+                <w:sz w:val="16"/>
+              </w:rPr>
+              <w:t>INCOMPLETE</w:t>
+            </w:r>
+          </w:p>
+        </w:tc>
+        <w:tc>
+          <w:tcPr>
+            <w:tcW w:w="2268" w:type="dxa"/>
+          </w:tcPr>
+          <w:p>
+            <w:pPr>
+              <w:cnfStyle w:val="000000100000" w:firstRow="0" w:lastRow="0" w:firstColumn="0" w:lastColumn="0" w:oddVBand="0" w:evenVBand="0" w:oddHBand="1" w:evenHBand="0" w:firstRowFirstColumn="0" w:firstRowLastColumn="0" w:lastRowFirstColumn="0" w:lastRowLastColumn="0"/>
+            </w:pPr>
+            <w:r>
+              <w:rPr>
+                <w:rFonts w:ascii="Arial" w:hAnsi="Arial"/>
+                <w:sz w:val="16"/>
+              </w:rPr>
+              <w:t>The first draft also assumed piano keys (two keys pressed together, half-pressed key) until the student corrected the control type. The pass thresholds (5 s start, 1 cm displacement, ± 1 s sweep period, 60 min endurance) are tester-defined assumptions.</w:t>
+            </w:r>
+          </w:p>
+        </w:tc>
+        <w:tc>
+          <w:tcPr>
+            <w:tcW w:w="2154" w:type="dxa"/>
+          </w:tcPr>
+          <w:p>
+            <w:pPr>
+              <w:cnfStyle w:val="000000100000" w:firstRow="0" w:lastRow="0" w:firstColumn="0" w:lastColumn="0" w:oddVBand="0" w:evenVBand="0" w:oddHBand="1" w:evenHBand="0" w:firstRowFirstColumn="0" w:firstRowLastColumn="0" w:lastRowFirstColumn="0" w:lastRowLastColumn="0"/>
+            </w:pPr>
+            <w:r>
+              <w:rPr>
+                <w:rFonts w:ascii="Arial" w:hAnsi="Arial"/>
+                <w:sz w:val="16"/>
+              </w:rPr>
+              <w:t>Rewritten for the rotary knob (commit b36f3f4). On 27/09/2026, TC-08 was executed and failed the stop condition: the head sweeps more than one extra turn (DF-03). The sweep period and angle in TC-08 were not measured. The 5 s start (TC-02), the 1 cm base displacement (TC-13) and the 60 min endurance (TC-15) were not executed, so those thresholds remain unconfirmed.</w:t>
             </w:r>
           </w:p>
         </w:tc>
@@ -1763,27 +1803,24 @@
             <w:r>
               <w:rPr>
                 <w:rFonts w:ascii="Arial" w:hAnsi="Arial"/>
-                <w:i w:val="0"/>
                 <w:sz w:val="16"/>
               </w:rPr>
-              <w:t>Artifact #11 – R3 refined test suite draft</w:t>
+              <w:t>Artifact #12 – R3 "why the AI missed it" explanations</w:t>
+            </w:r>
+            <w:r>
+              <w:rPr>
+                <w:rFonts w:ascii="Arial" w:hAnsi="Arial"/>
+                <w:sz w:val="16"/>
+              </w:rPr>
               <w:br/>
             </w:r>
             <w:r>
               <w:rPr>
                 <w:rFonts w:ascii="Arial" w:hAnsi="Arial"/>
-                <w:i w:val="0"/>
                 <w:sz w:val="16"/>
               </w:rPr>
               <w:br/>
-            </w:r>
-            <w:r>
-              <w:rPr>
-                <w:rFonts w:ascii="Arial" w:hAnsi="Arial"/>
-                <w:i w:val="0"/>
-                <w:sz w:val="16"/>
-              </w:rPr>
-              <w:t>Cursor Agent (Claude Opus 5.5), 23:24–23:34 26/09/2026. Verbatim prompts omitted from Appendix A2 by student decision.</w:t>
+              <w:t>Cursor Agent (Claude Opus 5.5), 23:36 26/09/2026. The prompt is recorded in Appendix A2 (prompt_log.md).</w:t>
             </w:r>
           </w:p>
         </w:tc>
@@ -1798,10 +1835,9 @@
             <w:r>
               <w:rPr>
                 <w:rFonts w:ascii="Arial" w:hAnsi="Arial"/>
-                <w:i w:val="0"/>
                 <w:sz w:val="16"/>
               </w:rPr>
-              <w:t>report sections 3.1–3.5 (commits 3414a2d, b36f3f4, f2a856f).</w:t>
+              <w:t>section 3.4, "Why the AI missed it" column (commit 14b4efe).</w:t>
             </w:r>
           </w:p>
         </w:tc>
@@ -1816,10 +1852,9 @@
             <w:r>
               <w:rPr>
                 <w:rFonts w:ascii="Arial" w:hAnsi="Arial"/>
-                <w:i w:val="0"/>
                 <w:sz w:val="16"/>
               </w:rPr>
-              <w:t>INCOMPLETE</w:t>
+              <w:t>VALID</w:t>
             </w:r>
           </w:p>
         </w:tc>
@@ -1834,10 +1869,9 @@
             <w:r>
               <w:rPr>
                 <w:rFonts w:ascii="Arial" w:hAnsi="Arial"/>
-                <w:i w:val="0"/>
                 <w:sz w:val="16"/>
               </w:rPr>
-              <w:t>The first draft also assumed piano keys (two keys pressed together, half-pressed key) until the student corrected the control type. The pass thresholds (5 s start, 1 cm displacement, ± 1 s sweep period, 60 min endurance) are tester-defined assumptions, and no case has been executed yet.</w:t>
+              <w:t>Each explanation is traced to observable content of R3-T02 (its preconditions, its "observation-based" safety note, and the absence of any power-interruption case), and matches the error-guessing rationale of ISTQB §4.4.1.</w:t>
             </w:r>
           </w:p>
         </w:tc>
@@ -1852,10 +1886,112 @@
             <w:r>
               <w:rPr>
                 <w:rFonts w:ascii="Arial" w:hAnsi="Arial"/>
-                <w:i w:val="0"/>
                 <w:sz w:val="16"/>
               </w:rPr>
-              <w:t>Rewritten for the rotary knob (commit b36f3f4). [Thresholds to be confirmed during execution.]</w:t>
+              <w:t>None. The explanations in section 3.4 were accepted as written.</w:t>
+            </w:r>
+          </w:p>
+        </w:tc>
+      </w:tr>
+      <w:tr>
+        <w:trPr>
+          <w:cnfStyle w:val="000000100000" w:firstRow="0" w:lastRow="0" w:firstColumn="0" w:lastColumn="0" w:oddVBand="0" w:evenVBand="0" w:oddHBand="1" w:evenHBand="0" w:firstRowFirstColumn="0" w:firstRowLastColumn="0" w:lastRowFirstColumn="0" w:lastRowLastColumn="0"/>
+        </w:trPr>
+        <w:tc>
+          <w:tcPr>
+            <w:cnfStyle w:val="001000000000" w:firstRow="0" w:lastRow="0" w:firstColumn="1" w:lastColumn="0" w:oddVBand="0" w:evenVBand="0" w:oddHBand="0" w:evenHBand="0" w:firstRowFirstColumn="0" w:firstRowLastColumn="0" w:lastRowFirstColumn="0" w:lastRowLastColumn="0"/>
+            <w:tcW w:w="2154" w:type="dxa"/>
+          </w:tcPr>
+          <w:p>
+            <w:r>
+              <w:rPr>
+                <w:rFonts w:ascii="Arial" w:hAnsi="Arial"/>
+                <w:sz w:val="16"/>
+              </w:rPr>
+              <w:t>Artifact #13 – AI compliance drafts</w:t>
+            </w:r>
+            <w:r>
+              <w:rPr>
+                <w:rFonts w:ascii="Arial" w:hAnsi="Arial"/>
+                <w:sz w:val="16"/>
+              </w:rPr>
+              <w:br/>
+            </w:r>
+            <w:r>
+              <w:rPr>
+                <w:rFonts w:ascii="Arial" w:hAnsi="Arial"/>
+                <w:sz w:val="16"/>
+              </w:rPr>
+              <w:br/>
+              <w:t>Cursor Agent (Claude Opus 5.5), 23:44 26/09/2026. The prompt is recorded in Appendix A2 (prompt_log.md).</w:t>
+            </w:r>
+          </w:p>
+        </w:tc>
+        <w:tc>
+          <w:tcPr>
+            <w:tcW w:w="2041" w:type="dxa"/>
+          </w:tcPr>
+          <w:p>
+            <w:pPr>
+              <w:cnfStyle w:val="000000100000" w:firstRow="0" w:lastRow="0" w:firstColumn="0" w:lastColumn="0" w:oddVBand="0" w:evenVBand="0" w:oddHBand="1" w:evenHBand="0" w:firstRowFirstColumn="0" w:firstRowLastColumn="0" w:lastRowFirstColumn="0" w:lastRowLastColumn="0"/>
+            </w:pPr>
+            <w:r>
+              <w:rPr>
+                <w:rFonts w:ascii="Arial" w:hAnsi="Arial"/>
+                <w:sz w:val="16"/>
+              </w:rPr>
+              <w:t>AI Critique, Mandatory Disclosure, this appendix, and the filled AI-02, AI-03 and AI-05 templates in AI_Forms/.</w:t>
+            </w:r>
+          </w:p>
+        </w:tc>
+        <w:tc>
+          <w:tcPr>
+            <w:tcW w:w="1020" w:type="dxa"/>
+          </w:tcPr>
+          <w:p>
+            <w:pPr>
+              <w:cnfStyle w:val="000000100000" w:firstRow="0" w:lastRow="0" w:firstColumn="0" w:lastColumn="0" w:oddVBand="0" w:evenVBand="0" w:oddHBand="1" w:evenHBand="0" w:firstRowFirstColumn="0" w:firstRowLastColumn="0" w:lastRowFirstColumn="0" w:lastRowLastColumn="0"/>
+            </w:pPr>
+            <w:r>
+              <w:rPr>
+                <w:rFonts w:ascii="Arial" w:hAnsi="Arial"/>
+                <w:sz w:val="16"/>
+              </w:rPr>
+              <w:t>INCOMPLETE</w:t>
+            </w:r>
+          </w:p>
+        </w:tc>
+        <w:tc>
+          <w:tcPr>
+            <w:tcW w:w="2268" w:type="dxa"/>
+          </w:tcPr>
+          <w:p>
+            <w:pPr>
+              <w:cnfStyle w:val="000000100000" w:firstRow="0" w:lastRow="0" w:firstColumn="0" w:lastColumn="0" w:oddVBand="0" w:evenVBand="0" w:oddHBand="1" w:evenHBand="0" w:firstRowFirstColumn="0" w:firstRowLastColumn="0" w:lastRowFirstColumn="0" w:lastRowLastColumn="0"/>
+            </w:pPr>
+            <w:r>
+              <w:rPr>
+                <w:rFonts w:ascii="Arial" w:hAnsi="Arial"/>
+                <w:sz w:val="16"/>
+              </w:rPr>
+              <w:t>The drafts needed the student's review and identity details before they could be accepted.</w:t>
+            </w:r>
+          </w:p>
+        </w:tc>
+        <w:tc>
+          <w:tcPr>
+            <w:tcW w:w="2154" w:type="dxa"/>
+          </w:tcPr>
+          <w:p>
+            <w:pPr>
+              <w:cnfStyle w:val="000000100000" w:firstRow="0" w:lastRow="0" w:firstColumn="0" w:lastColumn="0" w:oddVBand="0" w:evenVBand="0" w:oddHBand="1" w:evenHBand="0" w:firstRowFirstColumn="0" w:firstRowLastColumn="0" w:lastRowFirstColumn="0" w:lastRowLastColumn="0"/>
+            </w:pPr>
+            <w:r>
+              <w:rPr>
+                <w:rFonts w:ascii="Arial" w:hAnsi="Arial"/>
+                <w:sz w:val="16"/>
+              </w:rPr>
+              <w:t>Reviewed the AI Critique, the Mandatory Disclosure and this appendix. Filled the identity blocks on AI-02, AI-03 and AI-05 (Huỳnh Thái Toàn, 23120175, CQ2023/31, MSc. Trần Thị Bích Hạnh) and signed each form with the typed name.</w:t>
             </w:r>
           </w:p>
         </w:tc>
@@ -1873,27 +2009,24 @@
             <w:r>
               <w:rPr>
                 <w:rFonts w:ascii="Arial" w:hAnsi="Arial"/>
-                <w:i w:val="0"/>
                 <w:sz w:val="16"/>
               </w:rPr>
-              <w:t>Artifact #12 – R3 "why the AI missed it" explanations</w:t>
+              <w:t>Artifact #14 – Excel test workbook</w:t>
+            </w:r>
+            <w:r>
+              <w:rPr>
+                <w:rFonts w:ascii="Arial" w:hAnsi="Arial"/>
+                <w:sz w:val="16"/>
+              </w:rPr>
               <w:br/>
             </w:r>
             <w:r>
               <w:rPr>
                 <w:rFonts w:ascii="Arial" w:hAnsi="Arial"/>
-                <w:i w:val="0"/>
                 <w:sz w:val="16"/>
               </w:rPr>
               <w:br/>
-            </w:r>
-            <w:r>
-              <w:rPr>
-                <w:rFonts w:ascii="Arial" w:hAnsi="Arial"/>
-                <w:i w:val="0"/>
-                <w:sz w:val="16"/>
-              </w:rPr>
-              <w:t>Cursor Agent (Claude Opus 5.5), 23:36 26/09/2026. Verbatim prompt omitted from Appendix A2 by student decision.</w:t>
+              <w:t>Cursor Agent (Claude Opus 5.5), 00:01 27/09/2026. The prompt is recorded in Appendix A2 (prompt_log.md).</w:t>
             </w:r>
           </w:p>
         </w:tc>
@@ -1908,10 +2041,9 @@
             <w:r>
               <w:rPr>
                 <w:rFonts w:ascii="Arial" w:hAnsi="Arial"/>
-                <w:i w:val="0"/>
                 <w:sz w:val="16"/>
               </w:rPr>
-              <w:t>section 3.4, "Why the AI missed it" column (commit 14b4efe).</w:t>
+              <w:t>HW01_Test_Workbook.xlsx (sheets Test Summary, Test Cases, Checklist, Defects) and report section 3.7 (commit e610c41).</w:t>
             </w:r>
           </w:p>
         </w:tc>
@@ -1926,10 +2058,9 @@
             <w:r>
               <w:rPr>
                 <w:rFonts w:ascii="Arial" w:hAnsi="Arial"/>
-                <w:i w:val="0"/>
                 <w:sz w:val="16"/>
               </w:rPr>
-              <w:t>VALID</w:t>
+              <w:t>INCOMPLETE</w:t>
             </w:r>
           </w:p>
         </w:tc>
@@ -1944,10 +2075,17 @@
             <w:r>
               <w:rPr>
                 <w:rFonts w:ascii="Arial" w:hAnsi="Arial"/>
-                <w:i w:val="0"/>
                 <w:sz w:val="16"/>
               </w:rPr>
-              <w:t>Each explanation is traced to observable content of R3-T02 (its preconditions, its "observation-based" safety note, and the absence of any power-interruption case), and matches the error-guessing rationale of ISTQB §4.4.1.</w:t>
+              <w:t xml:space="preserve">The Test Cases sheet is copied from section 3.5, but the 20 checklist items (checklist-based testing, ISTQB §4.4.3) and the summary formulas are new AI content. The formulas were not recalculated in </w:t>
+            </w:r>
+            <w:r>
+              <w:rPr>
+                <w:rFonts w:ascii="Arial" w:hAnsi="Arial"/>
+                <w:sz w:val="16"/>
+              </w:rPr>
+              <w:lastRenderedPageBreak/>
+              <w:t>Excel when generated, and a technique count in the first draft of section 3.7 was wrong (Error guessing 4 instead of 3) until it was checked against the test cases.</w:t>
             </w:r>
           </w:p>
         </w:tc>
@@ -1962,230 +2100,10 @@
             <w:r>
               <w:rPr>
                 <w:rFonts w:ascii="Arial" w:hAnsi="Arial"/>
-                <w:i w:val="0"/>
                 <w:sz w:val="16"/>
               </w:rPr>
-              <w:t>[None / edits made by the student]</w:t>
-            </w:r>
-          </w:p>
-        </w:tc>
-      </w:tr>
-      <w:tr>
-        <w:trPr>
-          <w:cnfStyle w:val="000000010000" w:firstRow="0" w:lastRow="0" w:firstColumn="0" w:lastColumn="0" w:oddVBand="0" w:evenVBand="0" w:oddHBand="0" w:evenHBand="1" w:firstRowFirstColumn="0" w:firstRowLastColumn="0" w:lastRowFirstColumn="0" w:lastRowLastColumn="0"/>
-        </w:trPr>
-        <w:tc>
-          <w:tcPr>
-            <w:cnfStyle w:val="001000000000" w:firstRow="0" w:lastRow="0" w:firstColumn="1" w:lastColumn="0" w:oddVBand="0" w:evenVBand="0" w:oddHBand="0" w:evenHBand="0" w:firstRowFirstColumn="0" w:firstRowLastColumn="0" w:lastRowFirstColumn="0" w:lastRowLastColumn="0"/>
-            <w:tcW w:w="2154" w:type="dxa"/>
-          </w:tcPr>
-          <w:p>
-            <w:r>
-              <w:rPr>
-                <w:rFonts w:ascii="Arial" w:hAnsi="Arial"/>
-                <w:i w:val="0"/>
-                <w:sz w:val="16"/>
-              </w:rPr>
-              <w:t>Artifact #13 – AI compliance drafts</w:t>
-              <w:br/>
-            </w:r>
-            <w:r>
-              <w:rPr>
-                <w:rFonts w:ascii="Arial" w:hAnsi="Arial"/>
-                <w:i w:val="0"/>
-                <w:sz w:val="16"/>
-              </w:rPr>
-              <w:br/>
-            </w:r>
-            <w:r>
-              <w:rPr>
-                <w:rFonts w:ascii="Arial" w:hAnsi="Arial"/>
-                <w:i w:val="0"/>
-                <w:sz w:val="16"/>
-              </w:rPr>
-              <w:t>Cursor Agent (Claude Opus 5.5), 23:44 26/09/2026. Verbatim prompt omitted from Appendix A2 by student decision.</w:t>
-            </w:r>
-          </w:p>
-        </w:tc>
-        <w:tc>
-          <w:tcPr>
-            <w:tcW w:w="2041" w:type="dxa"/>
-          </w:tcPr>
-          <w:p>
-            <w:pPr>
-              <w:cnfStyle w:val="000000010000" w:firstRow="0" w:lastRow="0" w:firstColumn="0" w:lastColumn="0" w:oddVBand="0" w:evenVBand="0" w:oddHBand="0" w:evenHBand="1" w:firstRowFirstColumn="0" w:firstRowLastColumn="0" w:lastRowFirstColumn="0" w:lastRowLastColumn="0"/>
-            </w:pPr>
-            <w:r>
-              <w:rPr>
-                <w:rFonts w:ascii="Arial" w:hAnsi="Arial"/>
-                <w:i w:val="0"/>
-                <w:sz w:val="16"/>
-              </w:rPr>
-              <w:t>AI Critique, Mandatory Disclosure, this appendix, and the filled AI-02, AI-03 and AI-05 templates in AI_Forms/.</w:t>
-            </w:r>
-          </w:p>
-        </w:tc>
-        <w:tc>
-          <w:tcPr>
-            <w:tcW w:w="1020" w:type="dxa"/>
-          </w:tcPr>
-          <w:p>
-            <w:pPr>
-              <w:cnfStyle w:val="000000010000" w:firstRow="0" w:lastRow="0" w:firstColumn="0" w:lastColumn="0" w:oddVBand="0" w:evenVBand="0" w:oddHBand="0" w:evenHBand="1" w:firstRowFirstColumn="0" w:firstRowLastColumn="0" w:lastRowFirstColumn="0" w:lastRowLastColumn="0"/>
-            </w:pPr>
-            <w:r>
-              <w:rPr>
-                <w:rFonts w:ascii="Arial" w:hAnsi="Arial"/>
-                <w:i w:val="0"/>
-                <w:sz w:val="16"/>
-              </w:rPr>
-              <w:t>INCOMPLETE</w:t>
-            </w:r>
-          </w:p>
-        </w:tc>
-        <w:tc>
-          <w:tcPr>
-            <w:tcW w:w="2268" w:type="dxa"/>
-          </w:tcPr>
-          <w:p>
-            <w:pPr>
-              <w:cnfStyle w:val="000000010000" w:firstRow="0" w:lastRow="0" w:firstColumn="0" w:lastColumn="0" w:oddVBand="0" w:evenVBand="0" w:oddHBand="0" w:evenHBand="1" w:firstRowFirstColumn="0" w:firstRowLastColumn="0" w:lastRowFirstColumn="0" w:lastRowLastColumn="0"/>
-            </w:pPr>
-            <w:r>
-              <w:rPr>
-                <w:rFonts w:ascii="Arial" w:hAnsi="Arial"/>
-                <w:i w:val="0"/>
-                <w:sz w:val="16"/>
-              </w:rPr>
-              <w:t>The drafts still need the student's signatures.</w:t>
-            </w:r>
-          </w:p>
-        </w:tc>
-        <w:tc>
-          <w:tcPr>
-            <w:tcW w:w="2154" w:type="dxa"/>
-          </w:tcPr>
-          <w:p>
-            <w:pPr>
-              <w:cnfStyle w:val="000000010000" w:firstRow="0" w:lastRow="0" w:firstColumn="0" w:lastColumn="0" w:oddVBand="0" w:evenVBand="0" w:oddHBand="0" w:evenHBand="1" w:firstRowFirstColumn="0" w:firstRowLastColumn="0" w:lastRowFirstColumn="0" w:lastRowLastColumn="0"/>
-            </w:pPr>
-            <w:r>
-              <w:rPr>
-                <w:rFonts w:ascii="Arial" w:hAnsi="Arial"/>
-                <w:i w:val="0"/>
-                <w:sz w:val="16"/>
-              </w:rPr>
-              <w:t>[Student details, review and signatures]</w:t>
-            </w:r>
-          </w:p>
-        </w:tc>
-      </w:tr>
-      <w:tr>
-        <w:trPr>
-          <w:cnfStyle w:val="000000010000" w:firstRow="0" w:lastRow="0" w:firstColumn="0" w:lastColumn="0" w:oddVBand="0" w:evenVBand="0" w:oddHBand="0" w:evenHBand="1" w:firstRowFirstColumn="0" w:firstRowLastColumn="0" w:lastRowFirstColumn="0" w:lastRowLastColumn="0"/>
-        </w:trPr>
-        <w:tc>
-          <w:tcPr>
-            <w:cnfStyle w:val="001000000000" w:firstRow="0" w:lastRow="0" w:firstColumn="1" w:lastColumn="0" w:oddVBand="0" w:evenVBand="0" w:oddHBand="0" w:evenHBand="0" w:firstRowFirstColumn="0" w:firstRowLastColumn="0" w:lastRowFirstColumn="0" w:lastRowLastColumn="0"/>
-            <w:tcW w:w="2154" w:type="dxa"/>
-          </w:tcPr>
-          <w:p>
-            <w:r>
-              <w:rPr>
-                <w:rFonts w:ascii="Arial" w:hAnsi="Arial"/>
-                <w:i w:val="0"/>
-                <w:sz w:val="16"/>
-              </w:rPr>
-              <w:t>Artifact #14 – Excel test workbook</w:t>
-              <w:br/>
-            </w:r>
-            <w:r>
-              <w:rPr>
-                <w:rFonts w:ascii="Arial" w:hAnsi="Arial"/>
-                <w:i w:val="0"/>
-                <w:sz w:val="16"/>
-              </w:rPr>
-              <w:br/>
-            </w:r>
-            <w:r>
-              <w:rPr>
-                <w:rFonts w:ascii="Arial" w:hAnsi="Arial"/>
-                <w:i w:val="0"/>
-                <w:sz w:val="16"/>
-              </w:rPr>
-              <w:t>Cursor Agent (Claude Opus 5.5), 00:01 27/09/2026. Verbatim prompt omitted from Appendix A2 by student decision.</w:t>
-            </w:r>
-          </w:p>
-        </w:tc>
-        <w:tc>
-          <w:tcPr>
-            <w:tcW w:w="2041" w:type="dxa"/>
-          </w:tcPr>
-          <w:p>
-            <w:pPr>
-              <w:cnfStyle w:val="000000010000" w:firstRow="0" w:lastRow="0" w:firstColumn="0" w:lastColumn="0" w:oddVBand="0" w:evenVBand="0" w:oddHBand="0" w:evenHBand="1" w:firstRowFirstColumn="0" w:firstRowLastColumn="0" w:lastRowFirstColumn="0" w:lastRowLastColumn="0"/>
-            </w:pPr>
-            <w:r>
-              <w:rPr>
-                <w:rFonts w:ascii="Arial" w:hAnsi="Arial"/>
-                <w:i w:val="0"/>
-                <w:sz w:val="16"/>
-              </w:rPr>
-              <w:t>HW01_Test_Workbook.xlsx (sheets Test Summary, Test Cases, Checklist, Defects) and report section 3.7 (commit e610c41).</w:t>
-            </w:r>
-          </w:p>
-        </w:tc>
-        <w:tc>
-          <w:tcPr>
-            <w:tcW w:w="1020" w:type="dxa"/>
-          </w:tcPr>
-          <w:p>
-            <w:pPr>
-              <w:cnfStyle w:val="000000010000" w:firstRow="0" w:lastRow="0" w:firstColumn="0" w:lastColumn="0" w:oddVBand="0" w:evenVBand="0" w:oddHBand="0" w:evenHBand="1" w:firstRowFirstColumn="0" w:firstRowLastColumn="0" w:lastRowFirstColumn="0" w:lastRowLastColumn="0"/>
-            </w:pPr>
-            <w:r>
-              <w:rPr>
-                <w:rFonts w:ascii="Arial" w:hAnsi="Arial"/>
-                <w:i w:val="0"/>
-                <w:sz w:val="16"/>
-              </w:rPr>
-              <w:t>INCOMPLETE</w:t>
-            </w:r>
-          </w:p>
-        </w:tc>
-        <w:tc>
-          <w:tcPr>
-            <w:tcW w:w="2268" w:type="dxa"/>
-          </w:tcPr>
-          <w:p>
-            <w:pPr>
-              <w:cnfStyle w:val="000000010000" w:firstRow="0" w:lastRow="0" w:firstColumn="0" w:lastColumn="0" w:oddVBand="0" w:evenVBand="0" w:oddHBand="0" w:evenHBand="1" w:firstRowFirstColumn="0" w:firstRowLastColumn="0" w:lastRowFirstColumn="0" w:lastRowLastColumn="0"/>
-            </w:pPr>
-            <w:r>
-              <w:rPr>
-                <w:rFonts w:ascii="Arial" w:hAnsi="Arial"/>
-                <w:i w:val="0"/>
-                <w:sz w:val="16"/>
-              </w:rPr>
-              <w:t>The Test Cases sheet is copied from section 3.5, but the 20 checklist items (checklist-based testing, ISTQB §4.4.3) and the summary formulas are new AI content. The formulas were not recalculated in Excel when generated, and a technique count in the first draft of section 3.7 was wrong (Error guessing 4 instead of 3) until it was checked against the test cases.</w:t>
-            </w:r>
-          </w:p>
-        </w:tc>
-        <w:tc>
-          <w:tcPr>
-            <w:tcW w:w="2154" w:type="dxa"/>
-          </w:tcPr>
-          <w:p>
-            <w:pPr>
-              <w:cnfStyle w:val="000000010000" w:firstRow="0" w:lastRow="0" w:firstColumn="0" w:lastColumn="0" w:oddVBand="0" w:evenVBand="0" w:oddHBand="0" w:evenHBand="1" w:firstRowFirstColumn="0" w:firstRowLastColumn="0" w:lastRowFirstColumn="0" w:lastRowLastColumn="0"/>
-            </w:pPr>
-            <w:r>
-              <w:rPr>
-                <w:rFonts w:ascii="Arial" w:hAnsi="Arial"/>
-                <w:i w:val="0"/>
-                <w:sz w:val="16"/>
-              </w:rPr>
-              <w:t>Count corrected. [Open the workbook in Excel and confirm the formulas and checklist items.]</w:t>
+              <w:lastRenderedPageBreak/>
+              <w:t>Count corrected. On 27/09/2026 the summary formulas were recalculated from the Test Cases, Checklist and Defects sheets. They match section 3.7: 15 cases, 9 executed (4 PASS, 5 FAIL, 6 NOT RUN), 5 videos, 5 AI-missed edge cases and 5 defects. Checklist items marked OK: 5 of 20; the other 15 stay NOT CHECKED because those checks were not done.</w:t>
             </w:r>
           </w:p>
         </w:tc>
@@ -2312,7 +2230,6 @@
             <w:r>
               <w:rPr>
                 <w:rFonts w:ascii="Arial" w:hAnsi="Arial"/>
-                <w:i w:val="0"/>
                 <w:sz w:val="21"/>
               </w:rPr>
               <w:t>14</w:t>
@@ -2330,7 +2247,6 @@
             <w:r>
               <w:rPr>
                 <w:rFonts w:ascii="Arial" w:hAnsi="Arial"/>
-                <w:i w:val="0"/>
                 <w:sz w:val="21"/>
               </w:rPr>
               <w:t>100%</w:t>
@@ -2368,7 +2284,6 @@
             <w:r>
               <w:rPr>
                 <w:rFonts w:ascii="Arial" w:hAnsi="Arial"/>
-                <w:i w:val="0"/>
                 <w:sz w:val="21"/>
               </w:rPr>
               <w:t>3 (#4, #8, #12)</w:t>
@@ -2386,7 +2301,6 @@
             <w:r>
               <w:rPr>
                 <w:rFonts w:ascii="Arial" w:hAnsi="Arial"/>
-                <w:i w:val="0"/>
                 <w:sz w:val="21"/>
               </w:rPr>
               <w:t>21.4%</w:t>
@@ -2424,7 +2338,6 @@
             <w:r>
               <w:rPr>
                 <w:rFonts w:ascii="Arial" w:hAnsi="Arial"/>
-                <w:i w:val="0"/>
                 <w:sz w:val="21"/>
               </w:rPr>
               <w:t>1 (#9)</w:t>
@@ -2442,7 +2355,6 @@
             <w:r>
               <w:rPr>
                 <w:rFonts w:ascii="Arial" w:hAnsi="Arial"/>
-                <w:i w:val="0"/>
                 <w:sz w:val="21"/>
               </w:rPr>
               <w:t>7.1%</w:t>
@@ -2480,7 +2392,6 @@
             <w:r>
               <w:rPr>
                 <w:rFonts w:ascii="Arial" w:hAnsi="Arial"/>
-                <w:i w:val="0"/>
                 <w:sz w:val="21"/>
               </w:rPr>
               <w:t>10 (#1, #2, #3, #5, #6, #7, #10, #11, #13, #14)</w:t>
@@ -2498,7 +2409,6 @@
             <w:r>
               <w:rPr>
                 <w:rFonts w:ascii="Arial" w:hAnsi="Arial"/>
-                <w:i w:val="0"/>
                 <w:sz w:val="21"/>
               </w:rPr>
               <w:t>71.4%</w:t>
@@ -2530,7 +2440,6 @@
       <w:r>
         <w:rPr>
           <w:rFonts w:ascii="Arial" w:hAnsi="Arial"/>
-          <w:i w:val="0"/>
         </w:rPr>
         <w:t>AI was useful for producing a first structure quickly: a 15-case table, defect explanations, a mindmap skeleton, and consistency checks across the report. It failed on precise facts (dates, version numbers, CVSS sources, URLs), on measurable expected results, and on edge cases that come from the physical device rather than from text. It also tended to assume instead of asking when the input was ambiguous. My recommendation: use AI for drafting, brainstorming coverage categories and reformatting, but never as a source of facts or as a test oracle. Every AI claim must be checked against a primary source, every expected result must be measurable, and edge cases and actual results must come from the tester's own analysis and execution on the real device.</w:t>
       </w:r>
@@ -2553,9 +2462,8 @@
       <w:r>
         <w:rPr>
           <w:rFonts w:ascii="Arial" w:hAnsi="Arial"/>
-          <w:i w:val="0"/>
         </w:rPr>
-        <w:t>"The QA/QC mindmap, the draft report text for Requirements 1 and 2, the initial and refined test cases for Requirement 3, and the drafts of the AI Audit Report and AI Critique were initially generated by ChatGPT (GPT-5.6 Luna), Cursor Agent (Claude Opus 5.5) and Codex (OpenAI); I reviewed and modified sections 1.3–1.4 (including the corrected mindmap), 2.3–2.4 and 3.3–3.5, added edge cases TC-06, TC-07, TC-10, TC-11 and TC-12 (proposed with Cursor and checked by me against the real Senko B813 fan); the Actual result and Verdict columns of section 3.5 were written entirely by me. The detailed AI Audit Report is attached as Appendix A. I confirm I did not use AI to generate any artifact listed in the prohibited category below."</w:t>
+        <w:t>"The QA/QC mindmap, the draft report text for Requirements 1 and 2, the initial and refined test cases for Requirement 3, and the drafts of the AI Audit Report and AI Critique were initially generated by ChatGPT (GPT-5.6 Luna), Cursor Agent (Claude Opus 5.5) and Codex (OpenAI); I reviewed and modified sections 1.3–1.4 (including the corrected mindmap), 2.3–2.4 and 3.3–3.5, added edge cases TC-06, TC-07, TC-10, TC-11 and TC-12 (proposed with Cursor and checked by me against the real Senko B813 fan); the Actual result and Verdict columns of section 3.5 were written from my own observations. On 27/09/2026 I reported the failures of TC-04, TC-08, TC-11 and TC-14; Cursor formatted those observations into sections 3.5–3.7, the workbook and GitHub Issues DF-02 to DF-05. The detailed AI Audit Report is attached as Appendix A. I confirm I did not use AI to generate any artifact listed in the prohibited category below."</w:t>
       </w:r>
     </w:p>
     <w:p>
@@ -2762,6 +2670,7 @@
                 <w:rFonts w:ascii="Arial" w:hAnsi="Arial"/>
                 <w:sz w:val="21"/>
               </w:rPr>
+              <w:lastRenderedPageBreak/>
               <w:t>Instructor:</w:t>
             </w:r>
           </w:p>
@@ -2850,6 +2759,76 @@
             <w:pPr>
               <w:cnfStyle w:val="000000010000" w:firstRow="0" w:lastRow="0" w:firstColumn="0" w:lastColumn="0" w:oddVBand="0" w:evenVBand="0" w:oddHBand="0" w:evenHBand="1" w:firstRowFirstColumn="0" w:firstRowLastColumn="0" w:lastRowFirstColumn="0" w:lastRowLastColumn="0"/>
             </w:pPr>
+            <w:r>
+              <w:rPr>
+                <w:rFonts w:ascii="Arial" w:hAnsi="Arial"/>
+                <w:sz w:val="21"/>
+              </w:rPr>
+              <w:t>Huỳnh Thái Toàn</w:t>
+            </w:r>
+            <w:r>
+              <w:rPr>
+                <w:rFonts w:ascii="Myriad Pro" w:hAnsi="Myriad Pro" w:cs="Tahoma"/>
+                <w:lang w:eastAsia="vi-VN"/>
+              </w:rPr>
+              <w:drawing>
+                <wp:inline distT="0" distB="0" distL="0" distR="0" wp14:anchorId="7B8CB1AF" wp14:editId="12E7FE9B">
+                  <wp:extent cx="816745" cy="434166"/>
+                  <wp:effectExtent l="0" t="0" r="0" b="0"/>
+                  <wp:docPr id="1018047995" name="Picture 2"/>
+                  <wp:cNvGraphicFramePr>
+                    <a:graphicFrameLocks xmlns:a="http://schemas.openxmlformats.org/drawingml/2006/main" noChangeAspect="1"/>
+                  </wp:cNvGraphicFramePr>
+                  <a:graphic xmlns:a="http://schemas.openxmlformats.org/drawingml/2006/main">
+                    <a:graphicData uri="http://schemas.openxmlformats.org/drawingml/2006/picture">
+                      <pic:pic xmlns:pic="http://schemas.openxmlformats.org/drawingml/2006/picture">
+                        <pic:nvPicPr>
+                          <pic:cNvPr id="1018047995" name="Picture 2"/>
+                          <pic:cNvPicPr/>
+                        </pic:nvPicPr>
+                        <pic:blipFill rotWithShape="1">
+                          <a:blip r:embed="rId6" cstate="print">
+                            <a:duotone>
+                              <a:schemeClr val="accent1">
+                                <a:shade val="45000"/>
+                                <a:satMod val="135000"/>
+                              </a:schemeClr>
+                              <a:prstClr val="white"/>
+                            </a:duotone>
+                            <a:extLst>
+                              <a:ext uri="{28A0092B-C50C-407E-A947-70E740481C1C}">
+                                <a14:useLocalDpi xmlns:a14="http://schemas.microsoft.com/office/drawing/2010/main" val="0"/>
+                              </a:ext>
+                            </a:extLst>
+                          </a:blip>
+                          <a:srcRect l="7270" t="22563" r="16482" b="25379"/>
+                          <a:stretch>
+                            <a:fillRect/>
+                          </a:stretch>
+                        </pic:blipFill>
+                        <pic:spPr bwMode="auto">
+                          <a:xfrm>
+                            <a:off x="0" y="0"/>
+                            <a:ext cx="891108" cy="473696"/>
+                          </a:xfrm>
+                          <a:prstGeom prst="rect">
+                            <a:avLst/>
+                          </a:prstGeom>
+                          <a:ln>
+                            <a:noFill/>
+                          </a:ln>
+                          <a:extLst>
+                            <a:ext uri="{53640926-AAD7-44D8-BBD7-CCE9431645EC}">
+                              <a14:shadowObscured xmlns:a14="http://schemas.microsoft.com/office/drawing/2010/main"/>
+                            </a:ext>
+                          </a:extLst>
+                        </pic:spPr>
+                      </pic:pic>
+                    </a:graphicData>
+                  </a:graphic>
+                </wp:inline>
+              </w:drawing>
+            </w:r>
           </w:p>
         </w:tc>
       </w:tr>
@@ -2953,7 +2932,7 @@
 </file>
 
 <file path=word/numbering.xml><?xml version="1.0" encoding="utf-8"?>
-<w:numbering xmlns:wpc="http://schemas.microsoft.com/office/word/2010/wordprocessingCanvas" xmlns:cx="http://schemas.microsoft.com/office/drawing/2014/chartex" xmlns:cx1="http://schemas.microsoft.com/office/drawing/2015/9/8/chartex" xmlns:cx2="http://schemas.microsoft.com/office/drawing/2015/10/21/chartex" xmlns:cx3="http://schemas.microsoft.com/office/drawing/2016/5/9/chartex" xmlns:cx4="http://schemas.microsoft.com/office/drawing/2016/5/10/chartex" xmlns:cx5="http://schemas.microsoft.com/office/drawing/2016/5/11/chartex" xmlns:cx6="http://schemas.microsoft.com/office/drawing/2016/5/12/chartex" xmlns:cx7="http://schemas.microsoft.com/office/drawing/2016/5/13/chartex" xmlns:cx8="http://schemas.microsoft.com/office/drawing/2016/5/14/chartex" xmlns:mc="http://schemas.openxmlformats.org/markup-compatibility/2006" xmlns:aink="http://schemas.microsoft.com/office/drawing/2016/ink" xmlns:am3d="http://schemas.microsoft.com/office/drawing/2017/model3d" xmlns:o="urn:schemas-microsoft-com:office:office" xmlns:oel="http://schemas.microsoft.com/office/2019/extlst" xmlns:r="http://schemas.openxmlformats.org/officeDocument/2006/relationships" xmlns:m="http://schemas.openxmlformats.org/officeDocument/2006/math" xmlns:v="urn:schemas-microsoft-com:vml" xmlns:wp14="http://schemas.microsoft.com/office/word/2010/wordprocessingDrawing" xmlns:wp="http://schemas.openxmlformats.org/drawingml/2006/wordprocessingDrawing" xmlns:w10="urn:schemas-microsoft-com:office:word" xmlns:w="http://schemas.openxmlformats.org/wordprocessingml/2006/main" xmlns:w14="http://schemas.microsoft.com/office/word/2010/wordml" xmlns:w15="http://schemas.microsoft.com/office/word/2012/wordml" xmlns:w16cex="http://schemas.microsoft.com/office/word/2018/wordml/cex" xmlns:w16cid="http://schemas.microsoft.com/office/word/2016/wordml/cid" xmlns:w16="http://schemas.microsoft.com/office/word/2018/wordml" xmlns:w16du="http://schemas.microsoft.com/office/word/2023/wordml/word16du" xmlns:w16sdtdh="http://schemas.microsoft.com/office/word/2020/wordml/sdtdatahash" xmlns:w16sdtfl="http://schemas.microsoft.com/office/word/2024/wordml/sdtformatlock" xmlns:w16se="http://schemas.microsoft.com/office/word/2015/wordml/symex" xmlns:wpg="http://schemas.microsoft.com/office/word/2010/wordprocessingGroup" xmlns:wpi="http://schemas.microsoft.com/office/word/2010/wordprocessingInk" xmlns:wne="http://schemas.microsoft.com/office/word/2006/wordml" xmlns:wps="http://schemas.microsoft.com/office/word/2010/wordprocessingShape" mc:Ignorable="w14 w15 w16se w16cid w16 w16cex w16sdtdh w16sdtfl w16du wp14">
+<w:numbering xmlns:wpc="http://schemas.microsoft.com/office/word/2010/wordprocessingCanvas" xmlns:cx="http://schemas.microsoft.com/office/drawing/2014/chartex" xmlns:cx1="http://schemas.microsoft.com/office/drawing/2015/9/8/chartex" xmlns:cx2="http://schemas.microsoft.com/office/drawing/2015/10/21/chartex" xmlns:cx3="http://schemas.microsoft.com/office/drawing/2016/5/9/chartex" xmlns:cx4="http://schemas.microsoft.com/office/drawing/2016/5/10/chartex" xmlns:cx5="http://schemas.microsoft.com/office/drawing/2016/5/11/chartex" xmlns:cx6="http://schemas.microsoft.com/office/drawing/2016/5/12/chartex" xmlns:cx7="http://schemas.microsoft.com/office/drawing/2016/5/13/chartex" xmlns:cx8="http://schemas.microsoft.com/office/drawing/2016/5/14/chartex" xmlns:mc="http://schemas.openxmlformats.org/markup-compatibility/2006" xmlns:m="http://schemas.openxmlformats.org/officeDocument/2006/math" xmlns:aink="http://schemas.microsoft.com/office/drawing/2016/ink" xmlns:am3d="http://schemas.microsoft.com/office/drawing/2017/model3d" xmlns:oel="http://schemas.microsoft.com/office/2019/extlst" xmlns:r="http://schemas.openxmlformats.org/officeDocument/2006/relationships" xmlns:wp14="http://schemas.microsoft.com/office/word/2010/wordprocessingDrawing" xmlns:wp="http://schemas.openxmlformats.org/drawingml/2006/wordprocessingDrawing" xmlns:wpg="http://schemas.microsoft.com/office/word/2010/wordprocessingGroup" xmlns:wpi="http://schemas.microsoft.com/office/word/2010/wordprocessingInk" xmlns:wps="http://schemas.microsoft.com/office/word/2010/wordprocessingShape" xmlns:o="urn:schemas-microsoft-com:office:office" xmlns:v="urn:schemas-microsoft-com:vml" xmlns:w10="urn:schemas-microsoft-com:office:word" xmlns:w="http://schemas.openxmlformats.org/wordprocessingml/2006/main" xmlns:w14="http://schemas.microsoft.com/office/word/2010/wordml" xmlns:w15="http://schemas.microsoft.com/office/word/2012/wordml" xmlns:w16cex="http://schemas.microsoft.com/office/word/2018/wordml/cex" xmlns:w16cid="http://schemas.microsoft.com/office/word/2016/wordml/cid" xmlns:w16="http://schemas.microsoft.com/office/word/2018/wordml" xmlns:w16sdtdh="http://schemas.microsoft.com/office/word/2020/wordml/sdtdatahash" xmlns:w16sdtfl="http://schemas.microsoft.com/office/word/2024/wordml/sdtformatlock" xmlns:w16se="http://schemas.microsoft.com/office/word/2015/wordml/symex" xmlns:w16du="http://schemas.microsoft.com/office/word/2023/wordml/word16du" xmlns:wne="http://schemas.microsoft.com/office/word/2006/wordml" mc:Ignorable="w14 w15 w16se w16cid w16 w16cex w16sdtdh w16sdtfl w16du wp14">
   <w:abstractNum w:abstractNumId="0" w15:restartNumberingAfterBreak="0">
     <w:nsid w:val="FFFFFF7C"/>
     <w:multiLevelType w:val="singleLevel"/>
@@ -3156,7 +3135,7 @@
 </file>
 
 <file path=word/styles.xml><?xml version="1.0" encoding="utf-8"?>
-<w:styles xmlns:mc="http://schemas.openxmlformats.org/markup-compatibility/2006" xmlns:r="http://schemas.openxmlformats.org/officeDocument/2006/relationships" xmlns:w="http://schemas.openxmlformats.org/wordprocessingml/2006/main" xmlns:w14="http://schemas.microsoft.com/office/word/2010/wordml" xmlns:w15="http://schemas.microsoft.com/office/word/2012/wordml" xmlns:w16cex="http://schemas.microsoft.com/office/word/2018/wordml/cex" xmlns:w16cid="http://schemas.microsoft.com/office/word/2016/wordml/cid" xmlns:w16="http://schemas.microsoft.com/office/word/2018/wordml" xmlns:w16du="http://schemas.microsoft.com/office/word/2023/wordml/word16du" xmlns:w16sdtdh="http://schemas.microsoft.com/office/word/2020/wordml/sdtdatahash" xmlns:w16sdtfl="http://schemas.microsoft.com/office/word/2024/wordml/sdtformatlock" xmlns:w16se="http://schemas.microsoft.com/office/word/2015/wordml/symex" mc:Ignorable="w14 w15 w16se w16cid w16 w16cex w16sdtdh w16sdtfl w16du">
+<w:styles xmlns:mc="http://schemas.openxmlformats.org/markup-compatibility/2006" xmlns:r="http://schemas.openxmlformats.org/officeDocument/2006/relationships" xmlns:w="http://schemas.openxmlformats.org/wordprocessingml/2006/main" xmlns:w14="http://schemas.microsoft.com/office/word/2010/wordml" xmlns:w15="http://schemas.microsoft.com/office/word/2012/wordml" xmlns:w16cex="http://schemas.microsoft.com/office/word/2018/wordml/cex" xmlns:w16cid="http://schemas.microsoft.com/office/word/2016/wordml/cid" xmlns:w16="http://schemas.microsoft.com/office/word/2018/wordml" xmlns:w16sdtdh="http://schemas.microsoft.com/office/word/2020/wordml/sdtdatahash" xmlns:w16sdtfl="http://schemas.microsoft.com/office/word/2024/wordml/sdtformatlock" xmlns:w16se="http://schemas.microsoft.com/office/word/2015/wordml/symex" xmlns:w16du="http://schemas.microsoft.com/office/word/2023/wordml/word16du" mc:Ignorable="w14 w15 w16se w16cid w16 w16cex w16sdtdh w16sdtfl w16du">
   <w:docDefaults>
     <w:rPrDefault>
       <w:rPr>

</xml_diff>